<commit_message>
HANDOVER updated by Aaryan
</commit_message>
<xml_diff>
--- a/HANDOVER_REPORT_HARSHIT.docx
+++ b/HANDOVER_REPORT_HARSHIT.docx
@@ -3377,230 +3377,215 @@
         <w:rPr/>
       </w:pPr>
       <w:r>
-        <w:rPr/>
         <w:t>pingme-website/</w:t>
         <w:br/>
         <w:t>│</w:t>
         <w:br/>
-        <w:t>├── public/                  # Static files served as-is (favicon, manifest, robots.txt)</w:t>
+        <w:t>├── public/                   # Static files served as-is (favicon, manifest, robots.txt)</w:t>
+        <w:br/>
+        <w:t>├── dist/                     # Vite build output for main site (gitignored)</w:t>
+        <w:br/>
+        <w:t>├── dist-nfc/                 # Separate build for nfc.plzpingme.com subdomain</w:t>
+        <w:br/>
+        <w:t>│   └── assets/               # Compiled JS/CSS for NFC landing page only</w:t>
         <w:br/>
         <w:t>│</w:t>
         <w:br/>
-        <w:t>├── functions/               # Firebase Cloud Functions (separate Node.js project)</w:t>
+        <w:t>├── functions/                # Firebase Cloud Functions (separate Node.js project)</w:t>
         <w:br/>
         <w:t>│   ├── src/</w:t>
         <w:br/>
-        <w:t>│   │   └── index.ts         # createOrder + verifyPayment endpoints</w:t>
+        <w:t>│   │   ├── index.js          # ALL Cloud Function endpoints (createOrder, verifyPayment, etc.)</w:t>
+        <w:br/>
+        <w:t>│   │   ├── invoiceEmail.js   # Invoice email sending helper</w:t>
+        <w:br/>
+        <w:t>│   │   └── invoiceUtils.js   # Invoice generation utilities (server-side)</w:t>
         <w:br/>
         <w:t>│   ├── package.json</w:t>
         <w:br/>
-        <w:t>│   └── .env.example         # RAZORPAY_KEY_SECRET goes here (server-side only)</w:t>
+        <w:t>│   └── .env.example          # Server-side secrets (Razorpay keys, SMTP etc.)</w:t>
         <w:br/>
         <w:t>│</w:t>
         <w:br/>
+        <w:t>├── scripts/                  # Admin &amp; maintenance scripts (run locally, never deployed)</w:t>
+        <w:br/>
+        <w:t>│   ├── create_nfc_orders.cjs # Bulk-import NFC buyers (creates Auth accounts &amp; profile docs)</w:t>
+        <w:br/>
+        <w:t>│   ├── create_nfc_orders.js  # ESM version of create_nfc_orders.cjs</w:t>
+        <w:br/>
+        <w:t>│   ├── import-results.csv    # Output of bulk NFC import (contains temp passwords - gitignored)</w:t>
+        <w:br/>
+        <w:t>│   ├── embedded-cards.csv    # Input data for bulk NFC card import</w:t>
+        <w:br/>
+        <w:t>│   ├── fix_missing_profiles.cjs # Repair script for missing public NFC profile docs</w:t>
+        <w:br/>
+        <w:t>│   ├── backfill_user_profiles.cjs # Backfills /users docs for existing Auth accounts</w:t>
+        <w:br/>
+        <w:t>│   ├── test_link_orders.js   # Patches userId on orders matched only by email</w:t>
+        <w:br/>
+        <w:t>│   ├── generate-static-html.mjs # Static HTML pre-rendering</w:t>
+        <w:br/>
+        <w:t>│   └── package.json          # Script dependencies (firebase-admin etc.)</w:t>
+        <w:br/>
+        <w:t>│</w:t>
+        <w:br/>
         <w:t>├── src/</w:t>
         <w:br/>
-        <w:t>│   ├── App.tsx              # Root component: router setup, all providers, lazy routes</w:t>
-        <w:br/>
-        <w:t>│   ├── main.tsx             # Entry point: renders &lt;App /&gt; into #root</w:t>
+        <w:t>│   ├── App.tsx               # Root component: router, providers, lazy routes</w:t>
+        <w:br/>
+        <w:t>│   ├── main.tsx              # Entry point for main site</w:t>
+        <w:br/>
+        <w:t>│   ├── nfc-main.tsx          # Entry point for nfc.plzpingme.com (renders NFCLanding only)</w:t>
+        <w:br/>
+        <w:t>│   ├── App.css / index.css   # Global styles + Tailwind base + CSS design tokens</w:t>
+        <w:br/>
+        <w:t>│   ├── vite-env.d.ts         # Vite environment type declarations</w:t>
         <w:br/>
         <w:t>│   │</w:t>
         <w:br/>
-        <w:t>│   ├── pages/               # One file per route — each imports MainLayout</w:t>
-        <w:br/>
-        <w:t>│   │   ├── Landing.tsx              # / — Home page</w:t>
-        <w:br/>
-        <w:t>│   │   ├── Products.tsx             # /products — Category grid</w:t>
-        <w:br/>
-        <w:t>│   │   ├── ProductDetail.tsx        # /products/:category/:id — Single product</w:t>
-        <w:br/>
-        <w:t>│   │   ├── Prebook.tsx              # /booking — Checkout + Razorpay payment</w:t>
-        <w:br/>
-        <w:t>│   │   ├── Profile.tsx              # /profile — User account</w:t>
-        <w:br/>
-        <w:t>│   │   ├── Admin.tsx                # /admin — Admin panel (orders, products, FAQs, messages)</w:t>
-        <w:br/>
-        <w:t>│   │   ├── About.tsx                # /about</w:t>
-        <w:br/>
-        <w:t>│   │   ├── Blog.tsx                 # /blog</w:t>
-        <w:br/>
-        <w:t>│   │   ├── Contact.tsx              # /contact — Contact form (saves to Firestore /contacts)</w:t>
-        <w:br/>
-        <w:t>│   │   ├── FAQ.tsx                  # /faq — Reads from Firestore /faqs</w:t>
-        <w:br/>
-        <w:t>│   │   ├── Partners.tsx             # /partners</w:t>
-        <w:br/>
-        <w:t>│   │   ├── PublicNFCProfile.tsx     # /:username — Public scan landing page</w:t>
-        <w:br/>
-        <w:t>│   │   ├── PricingShipment.tsx      # /pricing-shipment</w:t>
-        <w:br/>
-        <w:t>│   │   ├── PrivacyPolicy.tsx        # /privacy-policy</w:t>
-        <w:br/>
-        <w:t>│   │   ├── TermsConditions.tsx      # /terms-conditions</w:t>
-        <w:br/>
-        <w:t>│   │   ├── RefundPolicy.tsx         # /refund-policy</w:t>
-        <w:br/>
-        <w:t>│   │   └── auth/</w:t>
-        <w:br/>
-        <w:t>│   │       ├── Login.tsx            # /login</w:t>
-        <w:br/>
-        <w:t>│   │       ├── Signup.tsx           # /signup</w:t>
-        <w:br/>
-        <w:t>│   │       ├── ForgotPassword.tsx   # /forgot-password</w:t>
-        <w:br/>
-        <w:t>│   │       ├── VerifyEmail.tsx      # /verify-email — polls until emailVerified = true</w:t>
-        <w:br/>
-        <w:t>│   │       └── CompletePhone.tsx    # /complete-phone — collects phone after Google sign-in</w:t>
+        <w:t>│   ├── assets/               # Static media bundled by Vite</w:t>
+        <w:br/>
+        <w:t>│   │   ├── ping-me-logo.png, pingprocard.jpeg, pingwebsite-2.webp</w:t>
+        <w:br/>
+        <w:t>│   │   └── IMG_9847.mp4 / .webm  # Hero video</w:t>
         <w:br/>
         <w:t>│   │</w:t>
         <w:br/>
+        <w:t>│   ├── pages/</w:t>
+        <w:br/>
+        <w:t>│   │   ├── Landing.tsx            # /</w:t>
+        <w:br/>
+        <w:t>│   │   ├── Products.tsx           # /products</w:t>
+        <w:br/>
+        <w:t>│   │   ├── ProductDetail.tsx      # /products/:category/:id</w:t>
+        <w:br/>
+        <w:t>│   │   ├── Prebook.tsx            # /booking -- NFC profile setup + Razorpay payment</w:t>
+        <w:br/>
+        <w:t>│   │   ├── Profile.tsx            # /profile -- NFC order management</w:t>
+        <w:br/>
+        <w:t>│   │   ├── Admin.tsx              # /admin</w:t>
+        <w:br/>
+        <w:t>│   │   ├── About.tsx / Blog.tsx / Contact.tsx / FAQ.tsx / Partners.tsx</w:t>
+        <w:br/>
+        <w:t>│   │   ├── NotFound.tsx           # 404 fallback page</w:t>
+        <w:br/>
+        <w:t>│   │   │</w:t>
+        <w:br/>
+        <w:t>│   │   ├── [NFC PAGES]</w:t>
+        <w:br/>
+        <w:t>│   │   ├── PublicNFCProfile.tsx   # /:username -- PUBLIC scan page (MUST be last route)</w:t>
+        <w:br/>
+        <w:t>│   │   ├── PublicNFCProfile.css   # Styles for public NFC profile page</w:t>
+        <w:br/>
+        <w:t>│   │   ├── NFCLanding.tsx         # /nfc -- NFC marketing page + nfc.plzpingme.com</w:t>
+        <w:br/>
+        <w:t>│   │   ├── NfcLeadsDashboard.tsx  # /nfc-leads -- AI Lead CRM (auth required)</w:t>
+        <w:br/>
+        <w:t>│   │   ├── NfcVisitsDashboard.tsx # /nfc-visits -- Analytics dashboard (auth required)</w:t>
+        <w:br/>
+        <w:t>│   │   └── NfcPrivacyPolicy.tsx   # /nfc-privacy</w:t>
+        <w:br/>
+        <w:t>│   │</w:t>
+        <w:br/>
         <w:t>│   ├── components/</w:t>
         <w:br/>
-        <w:t>│   │   ├── Navbar.tsx               # Sticky top nav + cart side drawer</w:t>
-        <w:br/>
-        <w:t>│   │   ├── FooterNew.tsx            # Site footer with links and contact info</w:t>
-        <w:br/>
-        <w:t>│   │   ├── SmoothScroll.tsx         # Lenis smooth scroll + auto scroll-to-top on route change</w:t>
-        <w:br/>
-        <w:t>│   │   ├── Seo.tsx                  # Injects &lt;title&gt;, meta description, JSON-LD schema</w:t>
-        <w:br/>
-        <w:t>│   │   ├── LandingReviews.tsx       # Customer reviews section</w:t>
-        <w:br/>
-        <w:t>│   │   ├── DocsPage.tsx             # /docs page component</w:t>
-        <w:br/>
-        <w:t>│   │   ├── InvoiceTemplate.tsx      # Visual layout for PDF invoice</w:t>
-        <w:br/>
-        <w:t>│   │   ├── NFCProfileBuilder.tsx    # Post-purchase NFC profile wizard</w:t>
+        <w:t>│   │   ├── Navbar.tsx / FooterNew.tsx / SmoothScroll.tsx / Seo.tsx</w:t>
+        <w:br/>
+        <w:t>│   │   ├── CartButton.tsx / LandingReviews.tsx / DocsPage.tsx</w:t>
+        <w:br/>
+        <w:t>│   │   ├── InvoiceTemplate.tsx / InvoiceTemplate.css</w:t>
         <w:br/>
         <w:t>│   │   │</w:t>
         <w:br/>
         <w:t>│   │   ├── landing/</w:t>
         <w:br/>
-        <w:t>│   │   │   ├── LandingHero.tsx      # Full landing page content (hero, products, why us, etc.)</w:t>
-        <w:br/>
-        <w:t>│   │   │   └── LandingDownloadSection.tsx  # "Download the app" CTA block</w:t>
+        <w:t>│   │   │   └── LandingHero.tsx / LandingDownloadSection.tsx</w:t>
         <w:br/>
         <w:t>│   │   │</w:t>
         <w:br/>
         <w:t>│   │   ├── auth/</w:t>
         <w:br/>
-        <w:t>│   │   │   ├── ProtectedRoute.tsx   # Redirects to /login if not signed in</w:t>
-        <w:br/>
-        <w:t>│   │   │   ├── AdminRoute.tsx       # Redirects unless canAccessAdminPanel() is true</w:t>
-        <w:br/>
-        <w:t>│   │   │   ├── LoginForm.tsx</w:t>
-        <w:br/>
-        <w:t>│   │   │   ├── SignupForm.tsx</w:t>
-        <w:br/>
-        <w:t>│   │   │   ├── GoogleAuthButton.tsx</w:t>
-        <w:br/>
-        <w:t>│   │   │   ├── AuthLayout.tsx       # Shared wrapper for all auth pages</w:t>
-        <w:br/>
-        <w:t>│   │   │   └── ForgotPasswordForm.tsx</w:t>
+        <w:t>│   │   │   ├── GoogleAuthButton.tsx  # Google sign-in (handles imported-user link)</w:t>
+        <w:br/>
+        <w:t>│   │   │   ├── ProtectedRoute.tsx / AdminRoute.tsx</w:t>
+        <w:br/>
+        <w:t>│   │   │   ├── LoginForm.tsx / SignupForm.tsx / ForgotPasswordForm.tsx</w:t>
+        <w:br/>
+        <w:t>│   │   │   └── AuthLayout.tsx</w:t>
         <w:br/>
         <w:t>│   │   │</w:t>
         <w:br/>
         <w:t>│   │   ├── profile/</w:t>
         <w:br/>
-        <w:t>│   │   │   ├── PersonalInfoForm.tsx</w:t>
-        <w:br/>
-        <w:t>│   │   │   ├── AddressManagement.tsx</w:t>
-        <w:br/>
-        <w:t>│   │   │   ├── OrderHistory.tsx     # Reads from /booking collection</w:t>
-        <w:br/>
-        <w:t>│   │   │   ├── EmailSettings.tsx</w:t>
-        <w:br/>
-        <w:t>│   │   │   ├── SavedPayments.tsx</w:t>
-        <w:br/>
-        <w:t>│   │   │   ├── NFCEditModal.tsx</w:t>
-        <w:br/>
-        <w:t>│   │   │   └── UserAvatar.tsx</w:t>
+        <w:t>│   │   │   ├── OrderHistory.tsx      # Shows Edit NFC Profile buttons per card</w:t>
+        <w:br/>
+        <w:t>│   │   │   ├── NFCEditModal.tsx      # Dialog for editing NFC profile post-purchase</w:t>
+        <w:br/>
+        <w:t>│   │   │   ├── PersonalInfoForm.tsx / AddressManagement.tsx / EmailSettings.tsx</w:t>
+        <w:br/>
+        <w:t>│   │   │   └── EmailVerificationBanner.tsx / SavedPayments.tsx / UserAvatar.tsx</w:t>
         <w:br/>
         <w:t>│   │   │</w:t>
         <w:br/>
-        <w:t>│   │   └── ui/                      # shadcn/ui primitives — DO NOT edit manually</w:t>
-        <w:br/>
-        <w:t>│   │       └── (button, input, dialog, table, select, tabs, accordion, etc.)</w:t>
+        <w:t>│   │   └── ui/                       # shadcn/ui primitives -- DO NOT edit manually</w:t>
         <w:br/>
         <w:t>│   │</w:t>
         <w:br/>
+        <w:t>│   ├── config/</w:t>
+        <w:br/>
+        <w:t>│   │   └── constants.ts      # APP_CONFIG: SUPPORT_PHONE, SUPPORT_EMAIL etc.</w:t>
+        <w:br/>
+        <w:t>│   │</w:t>
+        <w:br/>
         <w:t>│   ├── contexts/</w:t>
         <w:br/>
-        <w:t>│   │   ├── AuthContext.tsx          # Auth state + methods (user, profile, login, logout)</w:t>
-        <w:br/>
-        <w:t>│   │   └── CartContext.tsx          # Cart state (persisted to localStorage: "pingme_cart")</w:t>
+        <w:t>│   │   ├── AuthContext.tsx   # Auth state (handles Google link for imported users)</w:t>
+        <w:br/>
+        <w:t>│   │   └── CartContext.tsx   # Cart state (localStorage)</w:t>
         <w:br/>
         <w:t>│   │</w:t>
         <w:br/>
-        <w:t>│   ├── lib/                         # Service layer — all Firebase calls live here</w:t>
-        <w:br/>
-        <w:t>│   │   ├── firebase.ts              # Firebase app init → exports: auth, db, storage</w:t>
-        <w:br/>
-        <w:t>│   │   ├── authService.ts           # signUp, signIn, Google auth, password reset</w:t>
-        <w:br/>
-        <w:t>│   │   ├── userService.ts           # Firestore CRUD for /users collection</w:t>
-        <w:br/>
-        <w:t>│   │   ├── productService.ts        # Real-time product + category listeners</w:t>
-        <w:br/>
-        <w:t>│   │   ├── productCatalog.ts        # Static helpers: slug normalization, category names</w:t>
-        <w:br/>
-        <w:t>│   │   ├── adminService.ts          # Admin: orders listener, contact messages CRUD</w:t>
-        <w:br/>
-        <w:t>│   │   ├── adminAccess.ts           # canAccessAdminPanel() — checks claim or /admins doc</w:t>
-        <w:br/>
-        <w:t>│   │   ├── prebookService.ts        # PrebookingRecord type + Firestore writes</w:t>
-        <w:br/>
-        <w:t>│   │   ├── paymentService.ts        # Razorpay order creation, verify, receipt PDF download</w:t>
-        <w:br/>
-        <w:t>│   │   ├── faqService.ts            # Firestore CRUD for /faqs</w:t>
-        <w:br/>
-        <w:t>│   │   ├── publicNfcService.ts      # Public NFC profile reads (no auth)</w:t>
-        <w:br/>
-        <w:t>│   │   ├── publicStatsService.ts    # Cached stats (customers count, vehicles protected)</w:t>
-        <w:br/>
-        <w:t>│   │   ├── blogContent.ts           # Static blog post data (no database — hardcoded)</w:t>
-        <w:br/>
-        <w:t>│   │   ├── invoiceUtils.ts          # Builds printable invoice from order data</w:t>
-        <w:br/>
-        <w:t>│   │   ├── nfcCheckout.ts           # NFC profile checkout helpers</w:t>
-        <w:br/>
-        <w:t>│   │   ├── installTrackingService.ts # PWA install tracking</w:t>
-        <w:br/>
-        <w:t>│   │   └── utils.ts                 # cn() — Tailwind class merge utility</w:t>
+        <w:t>│   ├── lib/                  # Service layer -- all Firebase + API calls live here</w:t>
+        <w:br/>
+        <w:t>│   │   ├── firebase.ts       # Firebase init (auth, db, storage)</w:t>
+        <w:br/>
+        <w:t>│   │   ├── authService.ts    # Google link flow for imported users</w:t>
+        <w:br/>
+        <w:t>│   │   ├── userService.ts / productService.ts / productCatalog.ts / adminService.ts / adminAccess.ts</w:t>
+        <w:br/>
+        <w:t>│   │   ├── prebookService.ts / paymentService.ts / faqService.ts / publicStatsService.ts</w:t>
+        <w:br/>
+        <w:t>│   │   ├── blogContent.ts / installTrackingService.ts / utils.ts / invoiceUtils.ts</w:t>
+        <w:br/>
+        <w:t>│   │   │</w:t>
+        <w:br/>
+        <w:t>│   │   ├── [NFC SERVICES]</w:t>
+        <w:br/>
+        <w:t>│   │   ├── nfcCheckout.ts    # isNfcCartItem, expandNfcCartUnits, etc.</w:t>
+        <w:br/>
+        <w:t>│   │   ├── publicNfcService.ts # fetchPublicNfcProfile, checkUsernameUniqueness, etc.</w:t>
+        <w:br/>
+        <w:t>│   │   │</w:t>
+        <w:br/>
+        <w:t>│   │   └── validations/</w:t>
+        <w:br/>
+        <w:t>│   │       └── auth.ts       # Zod schemas for validation</w:t>
         <w:br/>
         <w:t>│   │</w:t>
         <w:br/>
-        <w:t>│   ├── layouts/</w:t>
-        <w:br/>
-        <w:t>│   │   └── MainLayout.tsx           # Every page wraps with this → adds Navbar + FooterNew</w:t>
-        <w:br/>
-        <w:t>│   │</w:t>
-        <w:br/>
-        <w:t>│   ├── hooks/</w:t>
-        <w:br/>
-        <w:t>│   │   ├── use-toast.ts             # Toast notification hook (wraps sonner)</w:t>
-        <w:br/>
-        <w:t>│   │   └── use-mobile.tsx           # Returns true if viewport &lt; 768px</w:t>
-        <w:br/>
-        <w:t>│   │</w:t>
-        <w:br/>
         <w:t>│   └── types/</w:t>
         <w:br/>
-        <w:t>│       └── user.ts                  # UserProfile, DeliveryAddress TypeScript types</w:t>
+        <w:t>│       └── user.ts           # UserProfile, DeliveryAddress types</w:t>
         <w:br/>
         <w:t>│</w:t>
         <w:br/>
-        <w:t>├── firestore.rules              # Security rules deployed to Firebase</w:t>
-        <w:br/>
-        <w:t>├── firebase.json                # Firebase hosting + functions + rules config</w:t>
-        <w:br/>
-        <w:t>├── .firebaserc                  # Firebase project alias</w:t>
-        <w:br/>
-        <w:t>├── tailwind.config.ts           # Tailwind config — theme tokens defined here</w:t>
-        <w:br/>
-        <w:t>├── vite.config.ts               # Vite config — aliases, port 8080, build settings</w:t>
-        <w:br/>
-        <w:t>└── tsconfig.json</w:t>
+        <w:t>├── firestore.rules           # Firestore security rules</w:t>
+        <w:br/>
+        <w:t>├── firebase.json             # Hosting + functions + rules config</w:t>
+        <w:br/>
+        <w:t>├── tailwind.config.ts / postcss.config.js / eslint.config.js</w:t>
+        <w:br/>
+        <w:t>└── package.json / tsconfig.json</w:t>
       </w:r>
     </w:p>
     <w:p>
@@ -5716,6 +5701,354 @@
             <w:r>
               <w:rPr/>
               <w:t>—</w:t>
+            </w:r>
+          </w:p>
+        </w:tc>
+      </w:tr>
+      <w:tr>
+        <w:tc>
+          <w:tcPr>
+            <w:tcW w:type="dxa" w:w="2409"/>
+            <w:tcBorders>
+              <w:start w:val="single" w:sz="4" w:space="0" w:color="000000"/>
+              <w:bottom w:val="single" w:sz="4" w:space="0" w:color="000000"/>
+            </w:tcBorders>
+          </w:tcPr>
+          <w:p>
+            <w:pPr>
+              <w:pStyle w:val="TableContents"/>
+              <w:spacing w:before="40" w:after="40"/>
+            </w:pPr>
+            <w:r/>
+            <w:r>
+              <w:rPr>
+                <w:rFonts w:ascii="Liberation Mono" w:hAnsi="Liberation Mono"/>
+              </w:rPr>
+              <w:t>/nfc</w:t>
+            </w:r>
+          </w:p>
+        </w:tc>
+        <w:tc>
+          <w:tcPr>
+            <w:tcW w:type="dxa" w:w="2410"/>
+            <w:tcBorders>
+              <w:start w:val="single" w:sz="4" w:space="0" w:color="000000"/>
+              <w:bottom w:val="single" w:sz="4" w:space="0" w:color="000000"/>
+            </w:tcBorders>
+          </w:tcPr>
+          <w:p>
+            <w:pPr>
+              <w:pStyle w:val="TableContents"/>
+              <w:spacing w:before="40" w:after="40"/>
+            </w:pPr>
+            <w:r/>
+            <w:r>
+              <w:rPr>
+                <w:rFonts w:ascii="Liberation Mono" w:hAnsi="Liberation Mono"/>
+              </w:rPr>
+              <w:t>NFCLanding.tsx</w:t>
+            </w:r>
+          </w:p>
+        </w:tc>
+        <w:tc>
+          <w:tcPr>
+            <w:tcW w:type="dxa" w:w="2409"/>
+            <w:tcBorders>
+              <w:start w:val="single" w:sz="4" w:space="0" w:color="000000"/>
+              <w:bottom w:val="single" w:sz="4" w:space="0" w:color="000000"/>
+            </w:tcBorders>
+          </w:tcPr>
+          <w:p>
+            <w:pPr>
+              <w:pStyle w:val="TableContents"/>
+              <w:spacing w:before="40" w:after="40"/>
+            </w:pPr>
+            <w:r/>
+            <w:r>
+              <w:rPr/>
+              <w:t>No</w:t>
+            </w:r>
+          </w:p>
+        </w:tc>
+        <w:tc>
+          <w:tcPr>
+            <w:tcW w:type="dxa" w:w="2410"/>
+            <w:tcBorders>
+              <w:start w:val="single" w:sz="4" w:space="0" w:color="000000"/>
+              <w:bottom w:val="single" w:sz="4" w:space="0" w:color="000000"/>
+              <w:end w:val="single" w:sz="4" w:space="0" w:color="000000"/>
+            </w:tcBorders>
+          </w:tcPr>
+          <w:p>
+            <w:pPr>
+              <w:pStyle w:val="TableContents"/>
+              <w:spacing w:before="40" w:after="40"/>
+            </w:pPr>
+            <w:r/>
+            <w:r>
+              <w:rPr/>
+              <w:t>NFC product marketing page. Also served at nfc.plzpingme.com subdomain via nfc-main.tsx entry point.</w:t>
+            </w:r>
+          </w:p>
+        </w:tc>
+      </w:tr>
+      <w:tr>
+        <w:tc>
+          <w:tcPr>
+            <w:tcW w:type="dxa" w:w="2409"/>
+            <w:tcBorders>
+              <w:start w:val="single" w:sz="4" w:space="0" w:color="000000"/>
+              <w:bottom w:val="single" w:sz="4" w:space="0" w:color="000000"/>
+            </w:tcBorders>
+          </w:tcPr>
+          <w:p>
+            <w:pPr>
+              <w:pStyle w:val="TableContents"/>
+              <w:spacing w:before="40" w:after="40"/>
+            </w:pPr>
+            <w:r/>
+            <w:r>
+              <w:rPr>
+                <w:rFonts w:ascii="Liberation Mono" w:hAnsi="Liberation Mono"/>
+              </w:rPr>
+              <w:t>/nfc-leads</w:t>
+            </w:r>
+          </w:p>
+        </w:tc>
+        <w:tc>
+          <w:tcPr>
+            <w:tcW w:type="dxa" w:w="2410"/>
+            <w:tcBorders>
+              <w:start w:val="single" w:sz="4" w:space="0" w:color="000000"/>
+              <w:bottom w:val="single" w:sz="4" w:space="0" w:color="000000"/>
+            </w:tcBorders>
+          </w:tcPr>
+          <w:p>
+            <w:pPr>
+              <w:pStyle w:val="TableContents"/>
+              <w:spacing w:before="40" w:after="40"/>
+            </w:pPr>
+            <w:r/>
+            <w:r>
+              <w:rPr>
+                <w:rFonts w:ascii="Liberation Mono" w:hAnsi="Liberation Mono"/>
+              </w:rPr>
+              <w:t>NfcLeadsDashboard.tsx</w:t>
+            </w:r>
+          </w:p>
+        </w:tc>
+        <w:tc>
+          <w:tcPr>
+            <w:tcW w:type="dxa" w:w="2409"/>
+            <w:tcBorders>
+              <w:start w:val="single" w:sz="4" w:space="0" w:color="000000"/>
+              <w:bottom w:val="single" w:sz="4" w:space="0" w:color="000000"/>
+            </w:tcBorders>
+          </w:tcPr>
+          <w:p>
+            <w:pPr>
+              <w:pStyle w:val="TableContents"/>
+              <w:spacing w:before="40" w:after="40"/>
+            </w:pPr>
+            <w:r/>
+            <w:r>
+              <w:rPr/>
+              <w:t>Yes</w:t>
+            </w:r>
+          </w:p>
+        </w:tc>
+        <w:tc>
+          <w:tcPr>
+            <w:tcW w:type="dxa" w:w="2410"/>
+            <w:tcBorders>
+              <w:start w:val="single" w:sz="4" w:space="0" w:color="000000"/>
+              <w:bottom w:val="single" w:sz="4" w:space="0" w:color="000000"/>
+              <w:end w:val="single" w:sz="4" w:space="0" w:color="000000"/>
+            </w:tcBorders>
+          </w:tcPr>
+          <w:p>
+            <w:pPr>
+              <w:pStyle w:val="TableContents"/>
+              <w:spacing w:before="40" w:after="40"/>
+            </w:pPr>
+            <w:r/>
+            <w:r>
+              <w:rPr/>
+              <w:t>AI Lead CRM — shows visitors who scanned the card and submitted Share Back form. Calls GET /getNfcLeads. CSV export available.</w:t>
+            </w:r>
+          </w:p>
+        </w:tc>
+      </w:tr>
+      <w:tr>
+        <w:tc>
+          <w:tcPr>
+            <w:tcW w:type="dxa" w:w="2409"/>
+            <w:tcBorders>
+              <w:start w:val="single" w:sz="4" w:space="0" w:color="000000"/>
+              <w:bottom w:val="single" w:sz="4" w:space="0" w:color="000000"/>
+            </w:tcBorders>
+          </w:tcPr>
+          <w:p>
+            <w:pPr>
+              <w:pStyle w:val="TableContents"/>
+              <w:spacing w:before="40" w:after="40"/>
+            </w:pPr>
+            <w:r/>
+            <w:r>
+              <w:rPr>
+                <w:rFonts w:ascii="Liberation Mono" w:hAnsi="Liberation Mono"/>
+              </w:rPr>
+              <w:t>/nfc-visits</w:t>
+            </w:r>
+          </w:p>
+        </w:tc>
+        <w:tc>
+          <w:tcPr>
+            <w:tcW w:type="dxa" w:w="2410"/>
+            <w:tcBorders>
+              <w:start w:val="single" w:sz="4" w:space="0" w:color="000000"/>
+              <w:bottom w:val="single" w:sz="4" w:space="0" w:color="000000"/>
+            </w:tcBorders>
+          </w:tcPr>
+          <w:p>
+            <w:pPr>
+              <w:pStyle w:val="TableContents"/>
+              <w:spacing w:before="40" w:after="40"/>
+            </w:pPr>
+            <w:r/>
+            <w:r>
+              <w:rPr>
+                <w:rFonts w:ascii="Liberation Mono" w:hAnsi="Liberation Mono"/>
+              </w:rPr>
+              <w:t>NfcVisitsDashboard.tsx</w:t>
+            </w:r>
+          </w:p>
+        </w:tc>
+        <w:tc>
+          <w:tcPr>
+            <w:tcW w:type="dxa" w:w="2409"/>
+            <w:tcBorders>
+              <w:start w:val="single" w:sz="4" w:space="0" w:color="000000"/>
+              <w:bottom w:val="single" w:sz="4" w:space="0" w:color="000000"/>
+            </w:tcBorders>
+          </w:tcPr>
+          <w:p>
+            <w:pPr>
+              <w:pStyle w:val="TableContents"/>
+              <w:spacing w:before="40" w:after="40"/>
+            </w:pPr>
+            <w:r/>
+            <w:r>
+              <w:rPr/>
+              <w:t>Yes</w:t>
+            </w:r>
+          </w:p>
+        </w:tc>
+        <w:tc>
+          <w:tcPr>
+            <w:tcW w:type="dxa" w:w="2410"/>
+            <w:tcBorders>
+              <w:start w:val="single" w:sz="4" w:space="0" w:color="000000"/>
+              <w:bottom w:val="single" w:sz="4" w:space="0" w:color="000000"/>
+              <w:end w:val="single" w:sz="4" w:space="0" w:color="000000"/>
+            </w:tcBorders>
+          </w:tcPr>
+          <w:p>
+            <w:pPr>
+              <w:pStyle w:val="TableContents"/>
+              <w:spacing w:before="40" w:after="40"/>
+            </w:pPr>
+            <w:r/>
+            <w:r>
+              <w:rPr/>
+              <w:t>Analytics dashboard — total scans, device/OS/browser breakdown, 30-day traffic chart, recent visits. Calls GET /getNfcVisitAnalytics.</w:t>
+            </w:r>
+          </w:p>
+        </w:tc>
+      </w:tr>
+      <w:tr>
+        <w:tc>
+          <w:tcPr>
+            <w:tcW w:type="dxa" w:w="2409"/>
+            <w:tcBorders>
+              <w:start w:val="single" w:sz="4" w:space="0" w:color="000000"/>
+              <w:bottom w:val="single" w:sz="4" w:space="0" w:color="000000"/>
+            </w:tcBorders>
+          </w:tcPr>
+          <w:p>
+            <w:pPr>
+              <w:pStyle w:val="TableContents"/>
+              <w:spacing w:before="40" w:after="40"/>
+            </w:pPr>
+            <w:r/>
+            <w:r>
+              <w:rPr>
+                <w:rFonts w:ascii="Liberation Mono" w:hAnsi="Liberation Mono"/>
+              </w:rPr>
+              <w:t>/nfc-privacy</w:t>
+            </w:r>
+          </w:p>
+        </w:tc>
+        <w:tc>
+          <w:tcPr>
+            <w:tcW w:type="dxa" w:w="2410"/>
+            <w:tcBorders>
+              <w:start w:val="single" w:sz="4" w:space="0" w:color="000000"/>
+              <w:bottom w:val="single" w:sz="4" w:space="0" w:color="000000"/>
+            </w:tcBorders>
+          </w:tcPr>
+          <w:p>
+            <w:pPr>
+              <w:pStyle w:val="TableContents"/>
+              <w:spacing w:before="40" w:after="40"/>
+            </w:pPr>
+            <w:r/>
+            <w:r>
+              <w:rPr>
+                <w:rFonts w:ascii="Liberation Mono" w:hAnsi="Liberation Mono"/>
+              </w:rPr>
+              <w:t>NfcPrivacyPolicy.tsx</w:t>
+            </w:r>
+          </w:p>
+        </w:tc>
+        <w:tc>
+          <w:tcPr>
+            <w:tcW w:type="dxa" w:w="2409"/>
+            <w:tcBorders>
+              <w:start w:val="single" w:sz="4" w:space="0" w:color="000000"/>
+              <w:bottom w:val="single" w:sz="4" w:space="0" w:color="000000"/>
+            </w:tcBorders>
+          </w:tcPr>
+          <w:p>
+            <w:pPr>
+              <w:pStyle w:val="TableContents"/>
+              <w:spacing w:before="40" w:after="40"/>
+            </w:pPr>
+            <w:r/>
+            <w:r>
+              <w:rPr/>
+              <w:t>No</w:t>
+            </w:r>
+          </w:p>
+        </w:tc>
+        <w:tc>
+          <w:tcPr>
+            <w:tcW w:type="dxa" w:w="2410"/>
+            <w:tcBorders>
+              <w:start w:val="single" w:sz="4" w:space="0" w:color="000000"/>
+              <w:bottom w:val="single" w:sz="4" w:space="0" w:color="000000"/>
+              <w:end w:val="single" w:sz="4" w:space="0" w:color="000000"/>
+            </w:tcBorders>
+          </w:tcPr>
+          <w:p>
+            <w:pPr>
+              <w:pStyle w:val="TableContents"/>
+              <w:spacing w:before="40" w:after="40"/>
+            </w:pPr>
+            <w:r/>
+            <w:r>
+              <w:rPr/>
+              <w:t>Privacy policy specific to NFC product.</w:t>
             </w:r>
           </w:p>
         </w:tc>
@@ -8890,6 +9223,586 @@
           </w:p>
         </w:tc>
       </w:tr>
+      <w:tr>
+        <w:tc>
+          <w:tcPr>
+            <w:tcW w:type="dxa" w:w="1376"/>
+            <w:tcBorders>
+              <w:start w:val="single" w:sz="4" w:space="0" w:color="000000"/>
+              <w:bottom w:val="single" w:sz="4" w:space="0" w:color="000000"/>
+            </w:tcBorders>
+          </w:tcPr>
+          <w:p>
+            <w:pPr>
+              <w:pStyle w:val="TableContents"/>
+              <w:spacing w:before="40" w:after="40"/>
+            </w:pPr>
+            <w:r/>
+            <w:r>
+              <w:rPr>
+                <w:rFonts w:ascii="Liberation Mono" w:hAnsi="Liberation Mono"/>
+              </w:rPr>
+              <w:t>nfcProfiles/{docId}</w:t>
+            </w:r>
+          </w:p>
+        </w:tc>
+        <w:tc>
+          <w:tcPr>
+            <w:tcW w:type="dxa" w:w="1377"/>
+            <w:tcBorders>
+              <w:start w:val="single" w:sz="4" w:space="0" w:color="000000"/>
+              <w:bottom w:val="single" w:sz="4" w:space="0" w:color="000000"/>
+            </w:tcBorders>
+          </w:tcPr>
+          <w:p>
+            <w:pPr>
+              <w:pStyle w:val="TableContents"/>
+              <w:spacing w:before="40" w:after="40"/>
+            </w:pPr>
+            <w:r/>
+            <w:r>
+              <w:rPr/>
+              <w:t>Public NFC card profiles</w:t>
+            </w:r>
+          </w:p>
+        </w:tc>
+        <w:tc>
+          <w:tcPr>
+            <w:tcW w:type="dxa" w:w="1377"/>
+            <w:tcBorders>
+              <w:start w:val="single" w:sz="4" w:space="0" w:color="000000"/>
+              <w:bottom w:val="single" w:sz="4" w:space="0" w:color="000000"/>
+            </w:tcBorders>
+          </w:tcPr>
+          <w:p>
+            <w:pPr>
+              <w:pStyle w:val="TableContents"/>
+              <w:spacing w:before="40" w:after="40"/>
+            </w:pPr>
+            <w:r/>
+            <w:r>
+              <w:rPr/>
+              <w:t>✗</w:t>
+            </w:r>
+          </w:p>
+        </w:tc>
+        <w:tc>
+          <w:tcPr>
+            <w:tcW w:type="dxa" w:w="1377"/>
+            <w:tcBorders>
+              <w:start w:val="single" w:sz="4" w:space="0" w:color="000000"/>
+              <w:bottom w:val="single" w:sz="4" w:space="0" w:color="000000"/>
+            </w:tcBorders>
+          </w:tcPr>
+          <w:p>
+            <w:pPr>
+              <w:pStyle w:val="TableContents"/>
+              <w:spacing w:before="40" w:after="40"/>
+            </w:pPr>
+            <w:r/>
+            <w:r>
+              <w:rPr/>
+              <w:t>✗</w:t>
+            </w:r>
+          </w:p>
+        </w:tc>
+        <w:tc>
+          <w:tcPr>
+            <w:tcW w:type="dxa" w:w="1377"/>
+            <w:tcBorders>
+              <w:start w:val="single" w:sz="4" w:space="0" w:color="000000"/>
+              <w:bottom w:val="single" w:sz="4" w:space="0" w:color="000000"/>
+            </w:tcBorders>
+          </w:tcPr>
+          <w:p>
+            <w:pPr>
+              <w:pStyle w:val="TableContents"/>
+              <w:spacing w:before="40" w:after="40"/>
+            </w:pPr>
+            <w:r/>
+            <w:r>
+              <w:rPr/>
+              <w:t>✗</w:t>
+            </w:r>
+          </w:p>
+        </w:tc>
+        <w:tc>
+          <w:tcPr>
+            <w:tcW w:type="dxa" w:w="1377"/>
+            <w:tcBorders>
+              <w:start w:val="single" w:sz="4" w:space="0" w:color="000000"/>
+              <w:bottom w:val="single" w:sz="4" w:space="0" w:color="000000"/>
+            </w:tcBorders>
+          </w:tcPr>
+          <w:p>
+            <w:pPr>
+              <w:pStyle w:val="TableContents"/>
+              <w:spacing w:before="40" w:after="40"/>
+            </w:pPr>
+            <w:r/>
+            <w:r>
+              <w:rPr/>
+              <w:t>Function only</w:t>
+            </w:r>
+          </w:p>
+        </w:tc>
+        <w:tc>
+          <w:tcPr>
+            <w:tcW w:type="dxa" w:w="1377"/>
+            <w:tcBorders>
+              <w:start w:val="single" w:sz="4" w:space="0" w:color="000000"/>
+              <w:bottom w:val="single" w:sz="4" w:space="0" w:color="000000"/>
+              <w:end w:val="single" w:sz="4" w:space="0" w:color="000000"/>
+            </w:tcBorders>
+          </w:tcPr>
+          <w:p>
+            <w:pPr>
+              <w:pStyle w:val="TableContents"/>
+              <w:spacing w:before="40" w:after="40"/>
+            </w:pPr>
+            <w:r/>
+            <w:r>
+              <w:rPr/>
+              <w:t>Read only</w:t>
+            </w:r>
+          </w:p>
+        </w:tc>
+      </w:tr>
+      <w:tr>
+        <w:tc>
+          <w:tcPr>
+            <w:tcW w:type="dxa" w:w="1376"/>
+            <w:tcBorders>
+              <w:start w:val="single" w:sz="4" w:space="0" w:color="000000"/>
+              <w:bottom w:val="single" w:sz="4" w:space="0" w:color="000000"/>
+            </w:tcBorders>
+          </w:tcPr>
+          <w:p>
+            <w:pPr>
+              <w:pStyle w:val="TableContents"/>
+              <w:spacing w:before="40" w:after="40"/>
+            </w:pPr>
+            <w:r/>
+            <w:r>
+              <w:rPr>
+                <w:rFonts w:ascii="Liberation Mono" w:hAnsi="Liberation Mono"/>
+              </w:rPr>
+              <w:t>nfcLeads/{leadId}</w:t>
+            </w:r>
+          </w:p>
+        </w:tc>
+        <w:tc>
+          <w:tcPr>
+            <w:tcW w:type="dxa" w:w="1377"/>
+            <w:tcBorders>
+              <w:start w:val="single" w:sz="4" w:space="0" w:color="000000"/>
+              <w:bottom w:val="single" w:sz="4" w:space="0" w:color="000000"/>
+            </w:tcBorders>
+          </w:tcPr>
+          <w:p>
+            <w:pPr>
+              <w:pStyle w:val="TableContents"/>
+              <w:spacing w:before="40" w:after="40"/>
+            </w:pPr>
+            <w:r/>
+            <w:r>
+              <w:rPr/>
+              <w:t>Leads from Share Back form</w:t>
+            </w:r>
+          </w:p>
+        </w:tc>
+        <w:tc>
+          <w:tcPr>
+            <w:tcW w:type="dxa" w:w="1377"/>
+            <w:tcBorders>
+              <w:start w:val="single" w:sz="4" w:space="0" w:color="000000"/>
+              <w:bottom w:val="single" w:sz="4" w:space="0" w:color="000000"/>
+            </w:tcBorders>
+          </w:tcPr>
+          <w:p>
+            <w:pPr>
+              <w:pStyle w:val="TableContents"/>
+              <w:spacing w:before="40" w:after="40"/>
+            </w:pPr>
+            <w:r/>
+            <w:r>
+              <w:rPr/>
+              <w:t>✗</w:t>
+            </w:r>
+          </w:p>
+        </w:tc>
+        <w:tc>
+          <w:tcPr>
+            <w:tcW w:type="dxa" w:w="1377"/>
+            <w:tcBorders>
+              <w:start w:val="single" w:sz="4" w:space="0" w:color="000000"/>
+              <w:bottom w:val="single" w:sz="4" w:space="0" w:color="000000"/>
+            </w:tcBorders>
+          </w:tcPr>
+          <w:p>
+            <w:pPr>
+              <w:pStyle w:val="TableContents"/>
+              <w:spacing w:before="40" w:after="40"/>
+            </w:pPr>
+            <w:r/>
+            <w:r>
+              <w:rPr/>
+              <w:t>✗</w:t>
+            </w:r>
+          </w:p>
+        </w:tc>
+        <w:tc>
+          <w:tcPr>
+            <w:tcW w:type="dxa" w:w="1377"/>
+            <w:tcBorders>
+              <w:start w:val="single" w:sz="4" w:space="0" w:color="000000"/>
+              <w:bottom w:val="single" w:sz="4" w:space="0" w:color="000000"/>
+            </w:tcBorders>
+          </w:tcPr>
+          <w:p>
+            <w:pPr>
+              <w:pStyle w:val="TableContents"/>
+              <w:spacing w:before="40" w:after="40"/>
+            </w:pPr>
+            <w:r/>
+            <w:r>
+              <w:rPr/>
+              <w:t>Owner only</w:t>
+            </w:r>
+          </w:p>
+        </w:tc>
+        <w:tc>
+          <w:tcPr>
+            <w:tcW w:type="dxa" w:w="1377"/>
+            <w:tcBorders>
+              <w:start w:val="single" w:sz="4" w:space="0" w:color="000000"/>
+              <w:bottom w:val="single" w:sz="4" w:space="0" w:color="000000"/>
+            </w:tcBorders>
+          </w:tcPr>
+          <w:p>
+            <w:pPr>
+              <w:pStyle w:val="TableContents"/>
+              <w:spacing w:before="40" w:after="40"/>
+            </w:pPr>
+            <w:r/>
+            <w:r>
+              <w:rPr/>
+              <w:t>Function only</w:t>
+            </w:r>
+          </w:p>
+        </w:tc>
+        <w:tc>
+          <w:tcPr>
+            <w:tcW w:type="dxa" w:w="1377"/>
+            <w:tcBorders>
+              <w:start w:val="single" w:sz="4" w:space="0" w:color="000000"/>
+              <w:bottom w:val="single" w:sz="4" w:space="0" w:color="000000"/>
+              <w:end w:val="single" w:sz="4" w:space="0" w:color="000000"/>
+            </w:tcBorders>
+          </w:tcPr>
+          <w:p>
+            <w:pPr>
+              <w:pStyle w:val="TableContents"/>
+              <w:spacing w:before="40" w:after="40"/>
+            </w:pPr>
+            <w:r/>
+            <w:r>
+              <w:rPr/>
+              <w:t>Read only</w:t>
+            </w:r>
+          </w:p>
+        </w:tc>
+      </w:tr>
+      <w:tr>
+        <w:tc>
+          <w:tcPr>
+            <w:tcW w:type="dxa" w:w="1376"/>
+            <w:tcBorders>
+              <w:start w:val="single" w:sz="4" w:space="0" w:color="000000"/>
+              <w:bottom w:val="single" w:sz="4" w:space="0" w:color="000000"/>
+            </w:tcBorders>
+          </w:tcPr>
+          <w:p>
+            <w:pPr>
+              <w:pStyle w:val="TableContents"/>
+              <w:spacing w:before="40" w:after="40"/>
+            </w:pPr>
+            <w:r/>
+            <w:r>
+              <w:rPr>
+                <w:rFonts w:ascii="Liberation Mono" w:hAnsi="Liberation Mono"/>
+              </w:rPr>
+              <w:t>nfcVisits/{visitId}</w:t>
+            </w:r>
+          </w:p>
+        </w:tc>
+        <w:tc>
+          <w:tcPr>
+            <w:tcW w:type="dxa" w:w="1377"/>
+            <w:tcBorders>
+              <w:start w:val="single" w:sz="4" w:space="0" w:color="000000"/>
+              <w:bottom w:val="single" w:sz="4" w:space="0" w:color="000000"/>
+            </w:tcBorders>
+          </w:tcPr>
+          <w:p>
+            <w:pPr>
+              <w:pStyle w:val="TableContents"/>
+              <w:spacing w:before="40" w:after="40"/>
+            </w:pPr>
+            <w:r/>
+            <w:r>
+              <w:rPr/>
+              <w:t>NFC profile visit analytics</w:t>
+            </w:r>
+          </w:p>
+        </w:tc>
+        <w:tc>
+          <w:tcPr>
+            <w:tcW w:type="dxa" w:w="1377"/>
+            <w:tcBorders>
+              <w:start w:val="single" w:sz="4" w:space="0" w:color="000000"/>
+              <w:bottom w:val="single" w:sz="4" w:space="0" w:color="000000"/>
+            </w:tcBorders>
+          </w:tcPr>
+          <w:p>
+            <w:pPr>
+              <w:pStyle w:val="TableContents"/>
+              <w:spacing w:before="40" w:after="40"/>
+            </w:pPr>
+            <w:r/>
+            <w:r>
+              <w:rPr/>
+              <w:t>✗</w:t>
+            </w:r>
+          </w:p>
+        </w:tc>
+        <w:tc>
+          <w:tcPr>
+            <w:tcW w:type="dxa" w:w="1377"/>
+            <w:tcBorders>
+              <w:start w:val="single" w:sz="4" w:space="0" w:color="000000"/>
+              <w:bottom w:val="single" w:sz="4" w:space="0" w:color="000000"/>
+            </w:tcBorders>
+          </w:tcPr>
+          <w:p>
+            <w:pPr>
+              <w:pStyle w:val="TableContents"/>
+              <w:spacing w:before="40" w:after="40"/>
+            </w:pPr>
+            <w:r/>
+            <w:r>
+              <w:rPr/>
+              <w:t>✗</w:t>
+            </w:r>
+          </w:p>
+        </w:tc>
+        <w:tc>
+          <w:tcPr>
+            <w:tcW w:type="dxa" w:w="1377"/>
+            <w:tcBorders>
+              <w:start w:val="single" w:sz="4" w:space="0" w:color="000000"/>
+              <w:bottom w:val="single" w:sz="4" w:space="0" w:color="000000"/>
+            </w:tcBorders>
+          </w:tcPr>
+          <w:p>
+            <w:pPr>
+              <w:pStyle w:val="TableContents"/>
+              <w:spacing w:before="40" w:after="40"/>
+            </w:pPr>
+            <w:r/>
+            <w:r>
+              <w:rPr/>
+              <w:t>Owner only</w:t>
+            </w:r>
+          </w:p>
+        </w:tc>
+        <w:tc>
+          <w:tcPr>
+            <w:tcW w:type="dxa" w:w="1377"/>
+            <w:tcBorders>
+              <w:start w:val="single" w:sz="4" w:space="0" w:color="000000"/>
+              <w:bottom w:val="single" w:sz="4" w:space="0" w:color="000000"/>
+            </w:tcBorders>
+          </w:tcPr>
+          <w:p>
+            <w:pPr>
+              <w:pStyle w:val="TableContents"/>
+              <w:spacing w:before="40" w:after="40"/>
+            </w:pPr>
+            <w:r/>
+            <w:r>
+              <w:rPr/>
+              <w:t>Function only</w:t>
+            </w:r>
+          </w:p>
+        </w:tc>
+        <w:tc>
+          <w:tcPr>
+            <w:tcW w:type="dxa" w:w="1377"/>
+            <w:tcBorders>
+              <w:start w:val="single" w:sz="4" w:space="0" w:color="000000"/>
+              <w:bottom w:val="single" w:sz="4" w:space="0" w:color="000000"/>
+              <w:end w:val="single" w:sz="4" w:space="0" w:color="000000"/>
+            </w:tcBorders>
+          </w:tcPr>
+          <w:p>
+            <w:pPr>
+              <w:pStyle w:val="TableContents"/>
+              <w:spacing w:before="40" w:after="40"/>
+            </w:pPr>
+            <w:r/>
+            <w:r>
+              <w:rPr/>
+              <w:t>Read only</w:t>
+            </w:r>
+          </w:p>
+        </w:tc>
+      </w:tr>
+      <w:tr>
+        <w:tc>
+          <w:tcPr>
+            <w:tcW w:type="dxa" w:w="1376"/>
+            <w:tcBorders>
+              <w:start w:val="single" w:sz="4" w:space="0" w:color="000000"/>
+              <w:bottom w:val="single" w:sz="4" w:space="0" w:color="000000"/>
+            </w:tcBorders>
+          </w:tcPr>
+          <w:p>
+            <w:pPr>
+              <w:pStyle w:val="TableContents"/>
+              <w:spacing w:before="40" w:after="40"/>
+            </w:pPr>
+            <w:r/>
+            <w:r>
+              <w:rPr>
+                <w:rFonts w:ascii="Liberation Mono" w:hAnsi="Liberation Mono"/>
+              </w:rPr>
+              <w:t>nfc_consents/{username}</w:t>
+            </w:r>
+          </w:p>
+        </w:tc>
+        <w:tc>
+          <w:tcPr>
+            <w:tcW w:type="dxa" w:w="1377"/>
+            <w:tcBorders>
+              <w:start w:val="single" w:sz="4" w:space="0" w:color="000000"/>
+              <w:bottom w:val="single" w:sz="4" w:space="0" w:color="000000"/>
+            </w:tcBorders>
+          </w:tcPr>
+          <w:p>
+            <w:pPr>
+              <w:pStyle w:val="TableContents"/>
+              <w:spacing w:before="40" w:after="40"/>
+            </w:pPr>
+            <w:r/>
+            <w:r>
+              <w:rPr/>
+              <w:t>NFC privacy consent records</w:t>
+            </w:r>
+          </w:p>
+        </w:tc>
+        <w:tc>
+          <w:tcPr>
+            <w:tcW w:type="dxa" w:w="1377"/>
+            <w:tcBorders>
+              <w:start w:val="single" w:sz="4" w:space="0" w:color="000000"/>
+              <w:bottom w:val="single" w:sz="4" w:space="0" w:color="000000"/>
+            </w:tcBorders>
+          </w:tcPr>
+          <w:p>
+            <w:pPr>
+              <w:pStyle w:val="TableContents"/>
+              <w:spacing w:before="40" w:after="40"/>
+            </w:pPr>
+            <w:r/>
+            <w:r>
+              <w:rPr/>
+              <w:t>✅</w:t>
+            </w:r>
+          </w:p>
+        </w:tc>
+        <w:tc>
+          <w:tcPr>
+            <w:tcW w:type="dxa" w:w="1377"/>
+            <w:tcBorders>
+              <w:start w:val="single" w:sz="4" w:space="0" w:color="000000"/>
+              <w:bottom w:val="single" w:sz="4" w:space="0" w:color="000000"/>
+            </w:tcBorders>
+          </w:tcPr>
+          <w:p>
+            <w:pPr>
+              <w:pStyle w:val="TableContents"/>
+              <w:spacing w:before="40" w:after="40"/>
+            </w:pPr>
+            <w:r/>
+            <w:r>
+              <w:rPr/>
+              <w:t>Anyone</w:t>
+            </w:r>
+          </w:p>
+        </w:tc>
+        <w:tc>
+          <w:tcPr>
+            <w:tcW w:type="dxa" w:w="1377"/>
+            <w:tcBorders>
+              <w:start w:val="single" w:sz="4" w:space="0" w:color="000000"/>
+              <w:bottom w:val="single" w:sz="4" w:space="0" w:color="000000"/>
+            </w:tcBorders>
+          </w:tcPr>
+          <w:p>
+            <w:pPr>
+              <w:pStyle w:val="TableContents"/>
+              <w:spacing w:before="40" w:after="40"/>
+            </w:pPr>
+            <w:r/>
+            <w:r>
+              <w:rPr/>
+              <w:t>✗</w:t>
+            </w:r>
+          </w:p>
+        </w:tc>
+        <w:tc>
+          <w:tcPr>
+            <w:tcW w:type="dxa" w:w="1377"/>
+            <w:tcBorders>
+              <w:start w:val="single" w:sz="4" w:space="0" w:color="000000"/>
+              <w:bottom w:val="single" w:sz="4" w:space="0" w:color="000000"/>
+            </w:tcBorders>
+          </w:tcPr>
+          <w:p>
+            <w:pPr>
+              <w:pStyle w:val="TableContents"/>
+              <w:spacing w:before="40" w:after="40"/>
+            </w:pPr>
+            <w:r/>
+            <w:r>
+              <w:rPr/>
+              <w:t>Anyone</w:t>
+            </w:r>
+          </w:p>
+        </w:tc>
+        <w:tc>
+          <w:tcPr>
+            <w:tcW w:type="dxa" w:w="1377"/>
+            <w:tcBorders>
+              <w:start w:val="single" w:sz="4" w:space="0" w:color="000000"/>
+              <w:bottom w:val="single" w:sz="4" w:space="0" w:color="000000"/>
+              <w:end w:val="single" w:sz="4" w:space="0" w:color="000000"/>
+            </w:tcBorders>
+          </w:tcPr>
+          <w:p>
+            <w:pPr>
+              <w:pStyle w:val="TableContents"/>
+              <w:spacing w:before="40" w:after="40"/>
+            </w:pPr>
+            <w:r/>
+            <w:r>
+              <w:rPr/>
+              <w:t>Read only</w:t>
+            </w:r>
+          </w:p>
+        </w:tc>
+      </w:tr>
     </w:tbl>
     <w:p>
       <w:pPr>
@@ -8901,6 +9814,254 @@
       <w:r>
         <w:rPr/>
       </w:r>
+    </w:p>
+    <w:p>
+      <w:pPr>
+        <w:pStyle w:val="Normal"/>
+      </w:pPr>
+      <w:r>
+        <w:t>nfcProfiles/{docId}</w:t>
+      </w:r>
+    </w:p>
+    <w:p>
+      <w:pPr>
+        <w:pStyle w:val="Normal"/>
+      </w:pPr>
+      <w:r>
+        <w:rPr>
+          <w:b/>
+        </w:rPr>
+        <w:t xml:space="preserve">  Document ID:</w:t>
+      </w:r>
+      <w:r>
+        <w:t xml:space="preserve"> {razorpayOrderId}_{lineKey} for multi-card orders, or just {orderId} for single-card/legacy</w:t>
+      </w:r>
+    </w:p>
+    <w:p>
+      <w:pPr>
+        <w:pStyle w:val="Normal"/>
+      </w:pPr>
+      <w:r>
+        <w:rPr>
+          <w:b/>
+        </w:rPr>
+        <w:t xml:space="preserve">  Fields:</w:t>
+      </w:r>
+      <w:r>
+        <w:t xml:space="preserve"> orderId, username, name, companyName, jobTitle, email, phone, bio, businessOverview, businessTags, website, address, companyAddress, googleMapsLink, linkedin, twitter, instagram, youtube, facebook, profilePhoto, projects[], documents[], upiId, razorpayLink, appointmentBookingLink, status (draft or confirmed), updatedSource</w:t>
+      </w:r>
+    </w:p>
+    <w:p>
+      <w:pPr>
+        <w:pStyle w:val="Normal"/>
+      </w:pPr>
+      <w:r>
+        <w:rPr>
+          <w:b/>
+        </w:rPr>
+        <w:t xml:space="preserve">  Written by:</w:t>
+      </w:r>
+      <w:r>
+        <w:t xml:space="preserve"> verifyPayment CF (confirmed), syncNfcProfileDraft CF (draft or confirmed)</w:t>
+      </w:r>
+    </w:p>
+    <w:p>
+      <w:pPr>
+        <w:pStyle w:val="Normal"/>
+      </w:pPr>
+      <w:r>
+        <w:rPr>
+          <w:b/>
+        </w:rPr>
+        <w:t xml:space="preserve">  Read by:</w:t>
+      </w:r>
+      <w:r>
+        <w:t xml:space="preserve"> getPublicNfcProfile CF (public, no auth), checkUsernameUniqueness() client</w:t>
+      </w:r>
+    </w:p>
+    <w:p>
+      <w:pPr>
+        <w:pStyle w:val="Normal"/>
+      </w:pPr>
+    </w:p>
+    <w:p>
+      <w:pPr>
+        <w:pStyle w:val="Normal"/>
+      </w:pPr>
+      <w:r>
+        <w:t>nfcLeads/{leadId}</w:t>
+      </w:r>
+    </w:p>
+    <w:p>
+      <w:pPr>
+        <w:pStyle w:val="Normal"/>
+      </w:pPr>
+      <w:r>
+        <w:rPr>
+          <w:b/>
+        </w:rPr>
+        <w:t xml:space="preserve">  Fields:</w:t>
+      </w:r>
+      <w:r>
+        <w:t xml:space="preserve"> cardOwnerUsername, visitorName, visitorEmail, visitorPhone, visitorCompany, leadAssessment (AI), personalizedEmailSubject (AI), personalizedEmailBody (AI), createdAt</w:t>
+      </w:r>
+    </w:p>
+    <w:p>
+      <w:pPr>
+        <w:pStyle w:val="Normal"/>
+      </w:pPr>
+      <w:r>
+        <w:rPr>
+          <w:b/>
+        </w:rPr>
+        <w:t xml:space="preserve">  Written by:</w:t>
+      </w:r>
+      <w:r>
+        <w:t xml:space="preserve"> sendReverseContactEmail CF (when visitor submits Share Back form)</w:t>
+      </w:r>
+    </w:p>
+    <w:p>
+      <w:pPr>
+        <w:pStyle w:val="Normal"/>
+      </w:pPr>
+      <w:r>
+        <w:rPr>
+          <w:b/>
+        </w:rPr>
+        <w:t xml:space="preserve">  Read by:</w:t>
+      </w:r>
+      <w:r>
+        <w:t xml:space="preserve"> getNfcLeads CF (authenticated — card owner only)</w:t>
+      </w:r>
+    </w:p>
+    <w:p>
+      <w:pPr>
+        <w:pStyle w:val="Normal"/>
+      </w:pPr>
+    </w:p>
+    <w:p>
+      <w:pPr>
+        <w:pStyle w:val="Normal"/>
+      </w:pPr>
+      <w:r>
+        <w:t>nfcVisits/{visitId}</w:t>
+      </w:r>
+    </w:p>
+    <w:p>
+      <w:pPr>
+        <w:pStyle w:val="Normal"/>
+      </w:pPr>
+      <w:r>
+        <w:rPr>
+          <w:b/>
+        </w:rPr>
+        <w:t xml:space="preserve">  Fields:</w:t>
+      </w:r>
+      <w:r>
+        <w:t xml:space="preserve"> username, timestamp, device, os, browser</w:t>
+      </w:r>
+    </w:p>
+    <w:p>
+      <w:pPr>
+        <w:pStyle w:val="Normal"/>
+      </w:pPr>
+      <w:r>
+        <w:rPr>
+          <w:b/>
+        </w:rPr>
+        <w:t xml:space="preserve">  Written by:</w:t>
+      </w:r>
+      <w:r>
+        <w:t xml:space="preserve"> trackNfcVisit CF (called non-blocking from public profile page on load)</w:t>
+      </w:r>
+    </w:p>
+    <w:p>
+      <w:pPr>
+        <w:pStyle w:val="Normal"/>
+      </w:pPr>
+      <w:r>
+        <w:rPr>
+          <w:b/>
+        </w:rPr>
+        <w:t xml:space="preserve">  Read by:</w:t>
+      </w:r>
+      <w:r>
+        <w:t xml:space="preserve"> getNfcVisitAnalytics CF (authenticated — card owner only)</w:t>
+      </w:r>
+    </w:p>
+    <w:p>
+      <w:pPr>
+        <w:pStyle w:val="Normal"/>
+      </w:pPr>
+    </w:p>
+    <w:p>
+      <w:pPr>
+        <w:pStyle w:val="Normal"/>
+      </w:pPr>
+      <w:r>
+        <w:t>nfc_consents/{username}</w:t>
+      </w:r>
+    </w:p>
+    <w:p>
+      <w:pPr>
+        <w:pStyle w:val="Normal"/>
+      </w:pPr>
+      <w:r>
+        <w:rPr>
+          <w:b/>
+        </w:rPr>
+        <w:t xml:space="preserve">  Document ID: </w:t>
+      </w:r>
+      <w:r>
+        <w:t>username (lowercased)</w:t>
+      </w:r>
+    </w:p>
+    <w:p>
+      <w:pPr>
+        <w:pStyle w:val="Normal"/>
+      </w:pPr>
+      <w:r>
+        <w:rPr>
+          <w:b/>
+        </w:rPr>
+        <w:t xml:space="preserve">  Fields: </w:t>
+      </w:r>
+      <w:r>
+        <w:t>consentGiven (boolean), acceptedAt (timestamp), username (string), userAgent (string)</w:t>
+      </w:r>
+    </w:p>
+    <w:p>
+      <w:pPr>
+        <w:pStyle w:val="Normal"/>
+      </w:pPr>
+      <w:r>
+        <w:rPr>
+          <w:b/>
+        </w:rPr>
+        <w:t xml:space="preserve">  Written by: </w:t>
+      </w:r>
+      <w:r>
+        <w:t>saveConsentToDb() in NfcPrivacyPolicy.tsx (public setDoc write, no auth required)</w:t>
+      </w:r>
+    </w:p>
+    <w:p>
+      <w:pPr>
+        <w:pStyle w:val="Normal"/>
+      </w:pPr>
+      <w:r>
+        <w:rPr>
+          <w:b/>
+        </w:rPr>
+        <w:t xml:space="preserve">  Read by: </w:t>
+      </w:r>
+      <w:r>
+        <w:t>checkConsentInDb() in NfcPrivacyPolicy.tsx (public getDoc read, no auth required)</w:t>
+      </w:r>
+    </w:p>
+    <w:p>
+      <w:pPr>
+        <w:pStyle w:val="Normal"/>
+      </w:pPr>
     </w:p>
     <w:p>
       <w:pPr>
@@ -10227,6 +11388,274 @@
                 <w:rFonts w:ascii="Liberation Mono" w:hAnsi="Liberation Mono"/>
               </w:rPr>
               <w:t>functions/src/index.ts</w:t>
+            </w:r>
+          </w:p>
+        </w:tc>
+      </w:tr>
+      <w:tr>
+        <w:tc>
+          <w:tcPr>
+            <w:tcW w:type="dxa" w:w="3212"/>
+            <w:tcBorders>
+              <w:start w:val="single" w:sz="4" w:space="0" w:color="000000"/>
+              <w:bottom w:val="single" w:sz="4" w:space="0" w:color="000000"/>
+            </w:tcBorders>
+          </w:tcPr>
+          <w:p>
+            <w:pPr>
+              <w:pStyle w:val="TableContents"/>
+              <w:spacing w:before="40" w:after="40"/>
+            </w:pPr>
+            <w:r/>
+            <w:r>
+              <w:rPr>
+                <w:rFonts w:ascii="Liberation Mono" w:hAnsi="Liberation Mono"/>
+              </w:rPr>
+              <w:t>nfcProfiles</w:t>
+            </w:r>
+          </w:p>
+        </w:tc>
+        <w:tc>
+          <w:tcPr>
+            <w:tcW w:type="dxa" w:w="3213"/>
+            <w:tcBorders>
+              <w:start w:val="single" w:sz="4" w:space="0" w:color="000000"/>
+              <w:bottom w:val="single" w:sz="4" w:space="0" w:color="000000"/>
+            </w:tcBorders>
+          </w:tcPr>
+          <w:p>
+            <w:pPr>
+              <w:pStyle w:val="TableContents"/>
+              <w:spacing w:before="40" w:after="40"/>
+            </w:pPr>
+            <w:r/>
+            <w:r>
+              <w:rPr/>
+              <w:t>Public NFC scan page, profile editing</w:t>
+            </w:r>
+          </w:p>
+        </w:tc>
+        <w:tc>
+          <w:tcPr>
+            <w:tcW w:type="dxa" w:w="3213"/>
+            <w:tcBorders>
+              <w:start w:val="single" w:sz="4" w:space="0" w:color="000000"/>
+              <w:bottom w:val="single" w:sz="4" w:space="0" w:color="000000"/>
+              <w:end w:val="single" w:sz="4" w:space="0" w:color="000000"/>
+            </w:tcBorders>
+          </w:tcPr>
+          <w:p>
+            <w:pPr>
+              <w:pStyle w:val="TableContents"/>
+              <w:spacing w:before="40" w:after="40"/>
+            </w:pPr>
+            <w:r/>
+            <w:r>
+              <w:rPr>
+                <w:rFonts w:ascii="Liberation Mono" w:hAnsi="Liberation Mono"/>
+              </w:rPr>
+              <w:t>src/pages/PublicNFCProfile.tsx, NFCEditModal.tsx</w:t>
+            </w:r>
+          </w:p>
+        </w:tc>
+      </w:tr>
+      <w:tr>
+        <w:tc>
+          <w:tcPr>
+            <w:tcW w:type="dxa" w:w="3212"/>
+            <w:tcBorders>
+              <w:start w:val="single" w:sz="4" w:space="0" w:color="000000"/>
+              <w:bottom w:val="single" w:sz="4" w:space="0" w:color="000000"/>
+            </w:tcBorders>
+          </w:tcPr>
+          <w:p>
+            <w:pPr>
+              <w:pStyle w:val="TableContents"/>
+              <w:spacing w:before="40" w:after="40"/>
+            </w:pPr>
+            <w:r/>
+            <w:r>
+              <w:rPr>
+                <w:rFonts w:ascii="Liberation Mono" w:hAnsi="Liberation Mono"/>
+              </w:rPr>
+              <w:t>nfcLeads</w:t>
+            </w:r>
+          </w:p>
+        </w:tc>
+        <w:tc>
+          <w:tcPr>
+            <w:tcW w:type="dxa" w:w="3213"/>
+            <w:tcBorders>
+              <w:start w:val="single" w:sz="4" w:space="0" w:color="000000"/>
+              <w:bottom w:val="single" w:sz="4" w:space="0" w:color="000000"/>
+            </w:tcBorders>
+          </w:tcPr>
+          <w:p>
+            <w:pPr>
+              <w:pStyle w:val="TableContents"/>
+              <w:spacing w:before="40" w:after="40"/>
+            </w:pPr>
+            <w:r/>
+            <w:r>
+              <w:rPr/>
+              <w:t>AI Lead capture CRM dashboard</w:t>
+            </w:r>
+          </w:p>
+        </w:tc>
+        <w:tc>
+          <w:tcPr>
+            <w:tcW w:type="dxa" w:w="3213"/>
+            <w:tcBorders>
+              <w:start w:val="single" w:sz="4" w:space="0" w:color="000000"/>
+              <w:bottom w:val="single" w:sz="4" w:space="0" w:color="000000"/>
+              <w:end w:val="single" w:sz="4" w:space="0" w:color="000000"/>
+            </w:tcBorders>
+          </w:tcPr>
+          <w:p>
+            <w:pPr>
+              <w:pStyle w:val="TableContents"/>
+              <w:spacing w:before="40" w:after="40"/>
+            </w:pPr>
+            <w:r/>
+            <w:r>
+              <w:rPr>
+                <w:rFonts w:ascii="Liberation Mono" w:hAnsi="Liberation Mono"/>
+              </w:rPr>
+              <w:t>src/pages/NfcLeadsDashboard.tsx, sendReverseContactEmail</w:t>
+            </w:r>
+          </w:p>
+        </w:tc>
+      </w:tr>
+      <w:tr>
+        <w:tc>
+          <w:tcPr>
+            <w:tcW w:type="dxa" w:w="3212"/>
+            <w:tcBorders>
+              <w:start w:val="single" w:sz="4" w:space="0" w:color="000000"/>
+              <w:bottom w:val="single" w:sz="4" w:space="0" w:color="000000"/>
+            </w:tcBorders>
+          </w:tcPr>
+          <w:p>
+            <w:pPr>
+              <w:pStyle w:val="TableContents"/>
+              <w:spacing w:before="40" w:after="40"/>
+            </w:pPr>
+            <w:r/>
+            <w:r>
+              <w:rPr>
+                <w:rFonts w:ascii="Liberation Mono" w:hAnsi="Liberation Mono"/>
+              </w:rPr>
+              <w:t>nfcVisits</w:t>
+            </w:r>
+          </w:p>
+        </w:tc>
+        <w:tc>
+          <w:tcPr>
+            <w:tcW w:type="dxa" w:w="3213"/>
+            <w:tcBorders>
+              <w:start w:val="single" w:sz="4" w:space="0" w:color="000000"/>
+              <w:bottom w:val="single" w:sz="4" w:space="0" w:color="000000"/>
+            </w:tcBorders>
+          </w:tcPr>
+          <w:p>
+            <w:pPr>
+              <w:pStyle w:val="TableContents"/>
+              <w:spacing w:before="40" w:after="40"/>
+            </w:pPr>
+            <w:r/>
+            <w:r>
+              <w:rPr/>
+              <w:t>NFC scan analytics dashboard</w:t>
+            </w:r>
+          </w:p>
+        </w:tc>
+        <w:tc>
+          <w:tcPr>
+            <w:tcW w:type="dxa" w:w="3213"/>
+            <w:tcBorders>
+              <w:start w:val="single" w:sz="4" w:space="0" w:color="000000"/>
+              <w:bottom w:val="single" w:sz="4" w:space="0" w:color="000000"/>
+              <w:end w:val="single" w:sz="4" w:space="0" w:color="000000"/>
+            </w:tcBorders>
+          </w:tcPr>
+          <w:p>
+            <w:pPr>
+              <w:pStyle w:val="TableContents"/>
+              <w:spacing w:before="40" w:after="40"/>
+            </w:pPr>
+            <w:r/>
+            <w:r>
+              <w:rPr>
+                <w:rFonts w:ascii="Liberation Mono" w:hAnsi="Liberation Mono"/>
+              </w:rPr>
+              <w:t>src/pages/NfcVisitsDashboard.tsx, trackNfcVisit</w:t>
+            </w:r>
+          </w:p>
+        </w:tc>
+      </w:tr>
+      <w:tr>
+        <w:tc>
+          <w:tcPr>
+            <w:tcW w:type="dxa" w:w="3212"/>
+            <w:tcBorders>
+              <w:start w:val="single" w:sz="4" w:space="0" w:color="000000"/>
+              <w:bottom w:val="single" w:sz="4" w:space="0" w:color="000000"/>
+            </w:tcBorders>
+          </w:tcPr>
+          <w:p>
+            <w:pPr>
+              <w:pStyle w:val="TableContents"/>
+              <w:spacing w:before="40" w:after="40"/>
+            </w:pPr>
+            <w:r/>
+            <w:r>
+              <w:rPr>
+                <w:rFonts w:ascii="Liberation Mono" w:hAnsi="Liberation Mono"/>
+              </w:rPr>
+              <w:t>nfc_consents</w:t>
+            </w:r>
+          </w:p>
+        </w:tc>
+        <w:tc>
+          <w:tcPr>
+            <w:tcW w:type="dxa" w:w="3213"/>
+            <w:tcBorders>
+              <w:start w:val="single" w:sz="4" w:space="0" w:color="000000"/>
+              <w:bottom w:val="single" w:sz="4" w:space="0" w:color="000000"/>
+            </w:tcBorders>
+          </w:tcPr>
+          <w:p>
+            <w:pPr>
+              <w:pStyle w:val="TableContents"/>
+              <w:spacing w:before="40" w:after="40"/>
+            </w:pPr>
+            <w:r/>
+            <w:r>
+              <w:rPr/>
+              <w:t>Privacy policy consent gate for public profiles</w:t>
+            </w:r>
+          </w:p>
+        </w:tc>
+        <w:tc>
+          <w:tcPr>
+            <w:tcW w:type="dxa" w:w="3213"/>
+            <w:tcBorders>
+              <w:start w:val="single" w:sz="4" w:space="0" w:color="000000"/>
+              <w:bottom w:val="single" w:sz="4" w:space="0" w:color="000000"/>
+              <w:end w:val="single" w:sz="4" w:space="0" w:color="000000"/>
+            </w:tcBorders>
+          </w:tcPr>
+          <w:p>
+            <w:pPr>
+              <w:pStyle w:val="TableContents"/>
+              <w:spacing w:before="40" w:after="40"/>
+            </w:pPr>
+            <w:r/>
+            <w:r>
+              <w:rPr>
+                <w:rFonts w:ascii="Liberation Mono" w:hAnsi="Liberation Mono"/>
+              </w:rPr>
+              <w:t>src/pages/NfcPrivacyPolicy.tsx</w:t>
             </w:r>
           </w:p>
         </w:tc>
@@ -13140,6 +14569,551 @@
     </w:p>
     <w:p>
       <w:pPr>
+        <w:pStyle w:val="Heading3"/>
+      </w:pPr>
+      <w:r>
+        <w:t>NFC-Specific Cloud Function Endpoints</w:t>
+      </w:r>
+    </w:p>
+    <w:p>
+      <w:pPr>
+        <w:pStyle w:val="BodyText"/>
+      </w:pPr>
+      <w:r>
+        <w:rPr>
+          <w:i/>
+        </w:rPr>
+        <w:t>(all deployed in asia-south1 region, same as createOrder/verifyPayment)</w:t>
+      </w:r>
+    </w:p>
+    <w:p>
+      <w:pPr>
+        <w:pStyle w:val="Normal"/>
+      </w:pPr>
+    </w:p>
+    <w:p>
+      <w:pPr>
+        <w:pStyle w:val="Heading4"/>
+      </w:pPr>
+      <w:r>
+        <w:t>POST /syncNfcProfileDraft</w:t>
+      </w:r>
+    </w:p>
+    <w:p>
+      <w:pPr>
+        <w:pStyle w:val="BodyText"/>
+      </w:pPr>
+      <w:r>
+        <w:rPr>
+          <w:b/>
+        </w:rPr>
+        <w:t>Auth required:</w:t>
+      </w:r>
+      <w:r>
+        <w:t xml:space="preserve"> Yes (Firebase ID token in Authorization header)</w:t>
+      </w:r>
+    </w:p>
+    <w:p>
+      <w:pPr>
+        <w:pStyle w:val="BodyText"/>
+      </w:pPr>
+      <w:r>
+        <w:rPr>
+          <w:b/>
+        </w:rPr>
+        <w:t>Purpose:</w:t>
+      </w:r>
+      <w:r>
+        <w:t xml:space="preserve"> Save or update an NFC profile in Firestore /nfcProfiles. Used for pre-payment drafts (status: "draft") AND confirmed profiles (status: "confirmed").</w:t>
+      </w:r>
+    </w:p>
+    <w:p>
+      <w:pPr>
+        <w:pStyle w:val="BodyText"/>
+      </w:pPr>
+      <w:r>
+        <w:rPr>
+          <w:b/>
+        </w:rPr>
+        <w:t>Body:</w:t>
+      </w:r>
+      <w:r>
+        <w:t xml:space="preserve"> { profileId: string, nfcProfile: { username, name, email, phone, ... }, orderData?: {...} }</w:t>
+      </w:r>
+    </w:p>
+    <w:p>
+      <w:pPr>
+        <w:pStyle w:val="BodyText"/>
+      </w:pPr>
+      <w:r>
+        <w:rPr>
+          <w:b/>
+        </w:rPr>
+        <w:t>Response:</w:t>
+      </w:r>
+      <w:r>
+        <w:t xml:space="preserve"> { success: true, username: string }</w:t>
+      </w:r>
+    </w:p>
+    <w:p>
+      <w:pPr>
+        <w:pStyle w:val="Normal"/>
+      </w:pPr>
+    </w:p>
+    <w:p>
+      <w:pPr>
+        <w:pStyle w:val="Heading4"/>
+      </w:pPr>
+      <w:r>
+        <w:t>POST /deleteNfcProfileDraft</w:t>
+      </w:r>
+    </w:p>
+    <w:p>
+      <w:pPr>
+        <w:pStyle w:val="BodyText"/>
+      </w:pPr>
+      <w:r>
+        <w:rPr>
+          <w:b/>
+        </w:rPr>
+        <w:t>Auth required:</w:t>
+      </w:r>
+      <w:r>
+        <w:t xml:space="preserve"> Yes</w:t>
+      </w:r>
+    </w:p>
+    <w:p>
+      <w:pPr>
+        <w:pStyle w:val="BodyText"/>
+      </w:pPr>
+      <w:r>
+        <w:rPr>
+          <w:b/>
+        </w:rPr>
+        <w:t>Purpose:</w:t>
+      </w:r>
+      <w:r>
+        <w:t xml:space="preserve"> Delete a draft profile from /nfcProfiles. Only deletes if status == "draft" or updatedSource == "prePaymentDraft". Called by client after verifyPayment to clean up pre-payment draft.</w:t>
+      </w:r>
+    </w:p>
+    <w:p>
+      <w:pPr>
+        <w:pStyle w:val="BodyText"/>
+      </w:pPr>
+      <w:r>
+        <w:rPr>
+          <w:b/>
+        </w:rPr>
+        <w:t>Body:</w:t>
+      </w:r>
+      <w:r>
+        <w:t xml:space="preserve"> { profileId: string }</w:t>
+      </w:r>
+    </w:p>
+    <w:p>
+      <w:pPr>
+        <w:pStyle w:val="BodyText"/>
+      </w:pPr>
+      <w:r>
+        <w:rPr>
+          <w:b/>
+        </w:rPr>
+        <w:t>Response:</w:t>
+      </w:r>
+      <w:r>
+        <w:t xml:space="preserve"> { success: true, deleted: true }</w:t>
+      </w:r>
+    </w:p>
+    <w:p>
+      <w:pPr>
+        <w:pStyle w:val="Normal"/>
+      </w:pPr>
+    </w:p>
+    <w:p>
+      <w:pPr>
+        <w:pStyle w:val="Heading4"/>
+      </w:pPr>
+      <w:r>
+        <w:t>GET /getPublicNfcProfile?username=&lt;name&gt;</w:t>
+      </w:r>
+    </w:p>
+    <w:p>
+      <w:pPr>
+        <w:pStyle w:val="BodyText"/>
+      </w:pPr>
+      <w:r>
+        <w:rPr>
+          <w:b/>
+        </w:rPr>
+        <w:t>Auth required:</w:t>
+      </w:r>
+      <w:r>
+        <w:t xml:space="preserve"> No (fully public)</w:t>
+      </w:r>
+    </w:p>
+    <w:p>
+      <w:pPr>
+        <w:pStyle w:val="BodyText"/>
+      </w:pPr>
+      <w:r>
+        <w:rPr>
+          <w:b/>
+        </w:rPr>
+        <w:t>Purpose:</w:t>
+      </w:r>
+      <w:r>
+        <w:t xml:space="preserve"> Fetch a confirmed NFC profile by username. Queries /nfcProfiles where username == &lt;name&gt; AND status == "confirmed".</w:t>
+      </w:r>
+    </w:p>
+    <w:p>
+      <w:pPr>
+        <w:pStyle w:val="BodyText"/>
+      </w:pPr>
+      <w:r>
+        <w:rPr>
+          <w:b/>
+        </w:rPr>
+        <w:t>Response:</w:t>
+      </w:r>
+      <w:r>
+        <w:t xml:space="preserve"> { profile: PublicNfcProfile }</w:t>
+      </w:r>
+    </w:p>
+    <w:p>
+      <w:pPr>
+        <w:pStyle w:val="BodyText"/>
+      </w:pPr>
+      <w:r>
+        <w:t>Also used by checkUsernameUniqueness() to validate username availability before purchase.</w:t>
+      </w:r>
+    </w:p>
+    <w:p>
+      <w:pPr>
+        <w:pStyle w:val="Normal"/>
+      </w:pPr>
+    </w:p>
+    <w:p>
+      <w:pPr>
+        <w:pStyle w:val="Heading4"/>
+      </w:pPr>
+      <w:r>
+        <w:t>POST /trackNfcVisit?username=&lt;name&gt;</w:t>
+      </w:r>
+    </w:p>
+    <w:p>
+      <w:pPr>
+        <w:pStyle w:val="BodyText"/>
+      </w:pPr>
+      <w:r>
+        <w:rPr>
+          <w:b/>
+        </w:rPr>
+        <w:t>Auth required:</w:t>
+      </w:r>
+      <w:r>
+        <w:t xml:space="preserve"> No</w:t>
+      </w:r>
+    </w:p>
+    <w:p>
+      <w:pPr>
+        <w:pStyle w:val="BodyText"/>
+      </w:pPr>
+      <w:r>
+        <w:rPr>
+          <w:b/>
+        </w:rPr>
+        <w:t>Purpose:</w:t>
+      </w:r>
+      <w:r>
+        <w:t xml:space="preserve"> Log a profile scan/visit to /nfcVisits. Records device, OS, browser from User-Agent. Called non-blocking (fire-and-forget) from PublicNFCProfile.tsx on every page load.</w:t>
+      </w:r>
+    </w:p>
+    <w:p>
+      <w:pPr>
+        <w:pStyle w:val="Normal"/>
+      </w:pPr>
+    </w:p>
+    <w:p>
+      <w:pPr>
+        <w:pStyle w:val="Heading4"/>
+      </w:pPr>
+      <w:r>
+        <w:t>GET /getNfcVisitAnalytics</w:t>
+      </w:r>
+    </w:p>
+    <w:p>
+      <w:pPr>
+        <w:pStyle w:val="BodyText"/>
+      </w:pPr>
+      <w:r>
+        <w:rPr>
+          <w:b/>
+        </w:rPr>
+        <w:t>Auth required:</w:t>
+      </w:r>
+      <w:r>
+        <w:t xml:space="preserve"> Yes</w:t>
+      </w:r>
+    </w:p>
+    <w:p>
+      <w:pPr>
+        <w:pStyle w:val="BodyText"/>
+      </w:pPr>
+      <w:r>
+        <w:rPr>
+          <w:b/>
+        </w:rPr>
+        <w:t>Purpose:</w:t>
+      </w:r>
+      <w:r>
+        <w:t xml:space="preserve"> Return analytics for the logged-in user's NFC profiles.</w:t>
+      </w:r>
+    </w:p>
+    <w:p>
+      <w:pPr>
+        <w:pStyle w:val="BodyText"/>
+      </w:pPr>
+      <w:r>
+        <w:rPr>
+          <w:b/>
+        </w:rPr>
+        <w:t>Response:</w:t>
+      </w:r>
+      <w:r>
+        <w:t xml:space="preserve"> { ownedUsernames[], selectedUsername, analytics: { totalVisits, deviceBreakdown, osBreakdown, browserBreakdown, trafficOverTime[] (last 30 days), recentVisits[] (last 15) } }</w:t>
+      </w:r>
+    </w:p>
+    <w:p>
+      <w:pPr>
+        <w:pStyle w:val="Normal"/>
+      </w:pPr>
+    </w:p>
+    <w:p>
+      <w:pPr>
+        <w:pStyle w:val="Heading4"/>
+      </w:pPr>
+      <w:r>
+        <w:t>POST /sendReverseContactEmail</w:t>
+      </w:r>
+    </w:p>
+    <w:p>
+      <w:pPr>
+        <w:pStyle w:val="BodyText"/>
+      </w:pPr>
+      <w:r>
+        <w:rPr>
+          <w:b/>
+        </w:rPr>
+        <w:t>Auth required:</w:t>
+      </w:r>
+      <w:r>
+        <w:t xml:space="preserve"> No (public endpoint called from the public NFC profile page)</w:t>
+      </w:r>
+    </w:p>
+    <w:p>
+      <w:pPr>
+        <w:pStyle w:val="BodyText"/>
+      </w:pPr>
+      <w:r>
+        <w:rPr>
+          <w:b/>
+        </w:rPr>
+        <w:t>Purpose:</w:t>
+      </w:r>
+      <w:r>
+        <w:t xml:space="preserve"> When a visitor submits the "Share My Info" form:</w:t>
+      </w:r>
+    </w:p>
+    <w:p>
+      <w:pPr>
+        <w:pStyle w:val="BodyText"/>
+      </w:pPr>
+      <w:r>
+        <w:t>1. Fetches card owner's email from /nfcProfiles</w:t>
+      </w:r>
+    </w:p>
+    <w:p>
+      <w:pPr>
+        <w:pStyle w:val="BodyText"/>
+      </w:pPr>
+      <w:r>
+        <w:t>2. Generates AI lead assessment + personalized follow-up email via Google Gemini</w:t>
+      </w:r>
+    </w:p>
+    <w:p>
+      <w:pPr>
+        <w:pStyle w:val="BodyText"/>
+      </w:pPr>
+      <w:r>
+        <w:t>3. Saves lead to Firestore /nfcLeads</w:t>
+      </w:r>
+    </w:p>
+    <w:p>
+      <w:pPr>
+        <w:pStyle w:val="BodyText"/>
+      </w:pPr>
+      <w:r>
+        <w:t>4. Sends email notification to card owner</w:t>
+      </w:r>
+    </w:p>
+    <w:p>
+      <w:pPr>
+        <w:pStyle w:val="BodyText"/>
+      </w:pPr>
+      <w:r>
+        <w:rPr>
+          <w:b/>
+        </w:rPr>
+        <w:t>Body:</w:t>
+      </w:r>
+      <w:r>
+        <w:t xml:space="preserve"> { cardOwnerUsername, cardOwnerName, visitorName, visitorEmail, visitorPhone?, visitorCompany? }</w:t>
+      </w:r>
+    </w:p>
+    <w:p>
+      <w:pPr>
+        <w:pStyle w:val="Normal"/>
+      </w:pPr>
+    </w:p>
+    <w:p>
+      <w:pPr>
+        <w:pStyle w:val="Heading4"/>
+      </w:pPr>
+      <w:r>
+        <w:t>GET /getNfcLeads</w:t>
+      </w:r>
+    </w:p>
+    <w:p>
+      <w:pPr>
+        <w:pStyle w:val="BodyText"/>
+      </w:pPr>
+      <w:r>
+        <w:rPr>
+          <w:b/>
+        </w:rPr>
+        <w:t>Auth required:</w:t>
+      </w:r>
+      <w:r>
+        <w:t xml:space="preserve"> Yes</w:t>
+      </w:r>
+    </w:p>
+    <w:p>
+      <w:pPr>
+        <w:pStyle w:val="BodyText"/>
+      </w:pPr>
+      <w:r>
+        <w:rPr>
+          <w:b/>
+        </w:rPr>
+        <w:t>Purpose:</w:t>
+      </w:r>
+      <w:r>
+        <w:t xml:space="preserve"> Return all leads for the logged-in user's NFC profiles.</w:t>
+      </w:r>
+    </w:p>
+    <w:p>
+      <w:pPr>
+        <w:pStyle w:val="BodyText"/>
+      </w:pPr>
+      <w:r>
+        <w:rPr>
+          <w:b/>
+        </w:rPr>
+        <w:t>Response:</w:t>
+      </w:r>
+      <w:r>
+        <w:t xml:space="preserve"> { ownedUsernames[], selectedUsername, leads: [{ id, cardOwnerUsername, visitorName, visitorEmail, visitorPhone, visitorCompany, leadAssessment, personalizedEmailSubject, personalizedEmailBody, createdAt }] }</w:t>
+      </w:r>
+    </w:p>
+    <w:p>
+      <w:pPr>
+        <w:pStyle w:val="Normal"/>
+      </w:pPr>
+    </w:p>
+    <w:p>
+      <w:pPr>
+        <w:pStyle w:val="Heading4"/>
+      </w:pPr>
+      <w:r>
+        <w:t>GET /getPublicStats</w:t>
+      </w:r>
+    </w:p>
+    <w:p>
+      <w:pPr>
+        <w:pStyle w:val="BodyText"/>
+      </w:pPr>
+      <w:r>
+        <w:rPr>
+          <w:b/>
+        </w:rPr>
+        <w:t>Auth required:</w:t>
+      </w:r>
+      <w:r>
+        <w:t xml:space="preserve"> No</w:t>
+      </w:r>
+    </w:p>
+    <w:p>
+      <w:pPr>
+        <w:pStyle w:val="BodyText"/>
+      </w:pPr>
+      <w:r>
+        <w:rPr>
+          <w:b/>
+        </w:rPr>
+        <w:t>Purpose:</w:t>
+      </w:r>
+      <w:r>
+        <w:t xml:space="preserve"> Returns cached public stats (customer count, vehicles protected). Used by homepage hero section.</w:t>
+      </w:r>
+    </w:p>
+    <w:p>
+      <w:pPr>
+        <w:pStyle w:val="Normal"/>
+      </w:pPr>
+    </w:p>
+    <w:p>
+      <w:pPr>
+        <w:pStyle w:val="Heading4"/>
+      </w:pPr>
+      <w:r>
+        <w:t>POST /trackInstall</w:t>
+      </w:r>
+    </w:p>
+    <w:p>
+      <w:pPr>
+        <w:pStyle w:val="BodyText"/>
+      </w:pPr>
+      <w:r>
+        <w:rPr>
+          <w:b/>
+        </w:rPr>
+        <w:t>Auth required:</w:t>
+      </w:r>
+      <w:r>
+        <w:t xml:space="preserve"> Yes</w:t>
+      </w:r>
+    </w:p>
+    <w:p>
+      <w:pPr>
+        <w:pStyle w:val="BodyText"/>
+      </w:pPr>
+      <w:r>
+        <w:rPr>
+          <w:b/>
+        </w:rPr>
+        <w:t>Purpose:</w:t>
+      </w:r>
+      <w:r>
+        <w:t xml:space="preserve"> Track PWA install events for logged-in users.</w:t>
+      </w:r>
+    </w:p>
+    <w:p>
+      <w:pPr>
+        <w:pStyle w:val="Normal"/>
+      </w:pPr>
+    </w:p>
+    <w:p>
+      <w:pPr>
         <w:pStyle w:val="Heading2"/>
         <w:bidi w:val="0"/>
         <w:ind w:hanging="0" w:start="0"/>
@@ -15006,6 +16980,326 @@
     </w:p>
     <w:p>
       <w:pPr>
+        <w:pStyle w:val="Heading3"/>
+      </w:pPr>
+      <w:r>
+        <w:t>nfcCheckout.ts — NFC cart and profile utilities</w:t>
+      </w:r>
+    </w:p>
+    <w:p>
+      <w:pPr>
+        <w:pStyle w:val="BodyText"/>
+      </w:pPr>
+      <w:r>
+        <w:t>Used in: Prebook.tsx, Profile.tsx, NFCEditModal.tsx, OrderHistory.tsx</w:t>
+      </w:r>
+    </w:p>
+    <w:p>
+      <w:pPr>
+        <w:pStyle w:val="BodyText"/>
+      </w:pPr>
+      <w:r>
+        <w:rPr>
+          <w:b/>
+        </w:rPr>
+        <w:t xml:space="preserve">isNfcCartItem(item) — </w:t>
+      </w:r>
+      <w:r>
+        <w:t>returns true if item.id starts with "nfc-"</w:t>
+      </w:r>
+    </w:p>
+    <w:p>
+      <w:pPr>
+        <w:pStyle w:val="BodyText"/>
+      </w:pPr>
+      <w:r>
+        <w:rPr>
+          <w:b/>
+        </w:rPr>
+        <w:t xml:space="preserve">expandNfcCartUnits(items) — </w:t>
+      </w:r>
+      <w:r>
+        <w:t>expands each NFC cart item by quantity into NfcCartUnit objects. Each unit gets a unique lineKey = "{itemId}__{unitIndex}".</w:t>
+      </w:r>
+    </w:p>
+    <w:p>
+      <w:pPr>
+        <w:pStyle w:val="BodyText"/>
+      </w:pPr>
+      <w:r>
+        <w:rPr>
+          <w:b/>
+        </w:rPr>
+        <w:t xml:space="preserve">getNfcProfileDocId(paymentOrderId, lineKey) — </w:t>
+      </w:r>
+      <w:r>
+        <w:t>builds Firestore doc ID for a profile.</w:t>
+      </w:r>
+    </w:p>
+    <w:p>
+      <w:pPr>
+        <w:pStyle w:val="BodyText"/>
+      </w:pPr>
+      <w:r>
+        <w:rPr>
+          <w:b/>
+        </w:rPr>
+        <w:t xml:space="preserve">resolveNfcProfileDocId(params) — </w:t>
+      </w:r>
+      <w:r>
+        <w:t>resolves correct doc ID: multi-card = paymentOrderId_lineKey | single = paymentOrderId or bookingId</w:t>
+      </w:r>
+    </w:p>
+    <w:p>
+      <w:pPr>
+        <w:pStyle w:val="BodyText"/>
+      </w:pPr>
+      <w:r>
+        <w:rPr>
+          <w:b/>
+        </w:rPr>
+        <w:t xml:space="preserve">getOwnedNfcProfileDocIds(params) — </w:t>
+      </w:r>
+      <w:r>
+        <w:t>all doc IDs that may own a username (for uniqueness checks)</w:t>
+      </w:r>
+    </w:p>
+    <w:p>
+      <w:pPr>
+        <w:pStyle w:val="BodyText"/>
+      </w:pPr>
+      <w:r>
+        <w:rPr>
+          <w:b/>
+        </w:rPr>
+        <w:t xml:space="preserve">getNfcLineProfilesFromOrder(order) — </w:t>
+      </w:r>
+      <w:r>
+        <w:t>extracts per-card profiles from an order document. Falls back to legacy single nfcProfile if nfcLineProfiles[] is not present.</w:t>
+      </w:r>
+    </w:p>
+    <w:p>
+      <w:pPr>
+        <w:pStyle w:val="BodyText"/>
+      </w:pPr>
+      <w:r>
+        <w:rPr>
+          <w:b/>
+        </w:rPr>
+        <w:t xml:space="preserve">isNfcLineProfileComplete(profile) — </w:t>
+      </w:r>
+      <w:r>
+        <w:t>validation: returns true if profile has at least a name.</w:t>
+      </w:r>
+    </w:p>
+    <w:p>
+      <w:pPr>
+        <w:pStyle w:val="Normal"/>
+      </w:pPr>
+    </w:p>
+    <w:p>
+      <w:pPr>
+        <w:pStyle w:val="Heading3"/>
+      </w:pPr>
+      <w:r>
+        <w:t>publicNfcService.ts — Public NFC profile API client (no auth required)</w:t>
+      </w:r>
+    </w:p>
+    <w:p>
+      <w:pPr>
+        <w:pStyle w:val="BodyText"/>
+      </w:pPr>
+      <w:r>
+        <w:t>Used in: PublicNFCProfile.tsx, NFCEditModal.tsx, NFCProfileBuilder.tsx, Prebook.tsx</w:t>
+      </w:r>
+    </w:p>
+    <w:p>
+      <w:pPr>
+        <w:pStyle w:val="BodyText"/>
+      </w:pPr>
+      <w:r>
+        <w:rPr>
+          <w:b/>
+        </w:rPr>
+        <w:t xml:space="preserve">fetchPublicNfcProfile(username) — </w:t>
+      </w:r>
+      <w:r>
+        <w:t>GET /getPublicNfcProfile with 5-minute in-memory cache.</w:t>
+      </w:r>
+    </w:p>
+    <w:p>
+      <w:pPr>
+        <w:pStyle w:val="BodyText"/>
+      </w:pPr>
+      <w:r>
+        <w:rPr>
+          <w:b/>
+        </w:rPr>
+        <w:t xml:space="preserve">checkUsernameUniqueness(username, owner?) — </w:t>
+      </w:r>
+      <w:r>
+        <w:t>returns true if username is taken by someone else. Pass owner context so current user can keep own username without false conflict.</w:t>
+      </w:r>
+    </w:p>
+    <w:p>
+      <w:pPr>
+        <w:pStyle w:val="BodyText"/>
+      </w:pPr>
+      <w:r>
+        <w:rPr>
+          <w:b/>
+        </w:rPr>
+        <w:t xml:space="preserve">generateUsernameSuggestions(baseName) — </w:t>
+      </w:r>
+      <w:r>
+        <w:t>returns 3 available username variants. Tries suffixes: "", "123", "_nfc", "official", etc.</w:t>
+      </w:r>
+    </w:p>
+    <w:p>
+      <w:pPr>
+        <w:pStyle w:val="BodyText"/>
+      </w:pPr>
+      <w:r>
+        <w:rPr>
+          <w:b/>
+        </w:rPr>
+        <w:t xml:space="preserve">normalizeNfcUsername(raw) — </w:t>
+      </w:r>
+      <w:r>
+        <w:t>lowercases, trims, strips trailing slashes.</w:t>
+      </w:r>
+    </w:p>
+    <w:p>
+      <w:pPr>
+        <w:pStyle w:val="BodyText"/>
+      </w:pPr>
+      <w:r>
+        <w:rPr>
+          <w:b/>
+        </w:rPr>
+        <w:t xml:space="preserve">isUsernameOwnedByProfileDoc(profileDocOrderId, owner) — </w:t>
+      </w:r>
+      <w:r>
+        <w:t>checks if a found profile belongs to current user.</w:t>
+      </w:r>
+    </w:p>
+    <w:p>
+      <w:pPr>
+        <w:pStyle w:val="Normal"/>
+      </w:pPr>
+    </w:p>
+    <w:p>
+      <w:pPr>
+        <w:pStyle w:val="Heading3"/>
+      </w:pPr>
+      <w:r>
+        <w:t>prebookService.ts — NFC-relevant additions (in addition to original order functions)</w:t>
+      </w:r>
+    </w:p>
+    <w:p>
+      <w:pPr>
+        <w:pStyle w:val="BodyText"/>
+      </w:pPr>
+      <w:r>
+        <w:t>Types exported: NFCProfile, NfcLineProfile (used throughout NFC flow)</w:t>
+      </w:r>
+    </w:p>
+    <w:p>
+      <w:pPr>
+        <w:pStyle w:val="BodyText"/>
+      </w:pPr>
+      <w:r>
+        <w:rPr>
+          <w:b/>
+        </w:rPr>
+        <w:t xml:space="preserve">getUserPrebookings({userId, email}) — </w:t>
+      </w:r>
+      <w:r>
+        <w:t>queries by userId first, falls back to email match (critical for imported users).</w:t>
+      </w:r>
+    </w:p>
+    <w:p>
+      <w:pPr>
+        <w:pStyle w:val="BodyText"/>
+      </w:pPr>
+      <w:r>
+        <w:rPr>
+          <w:b/>
+        </w:rPr>
+        <w:t xml:space="preserve">updatePrebookingNFCProfile(orderId, nfcProfile, profileId?, lineKey?) — </w:t>
+      </w:r>
+      <w:r>
+        <w:t>updates /booking order document AND calls syncNfcProfileDraft.</w:t>
+      </w:r>
+    </w:p>
+    <w:p>
+      <w:pPr>
+        <w:pStyle w:val="BodyText"/>
+      </w:pPr>
+      <w:r>
+        <w:rPr>
+          <w:b/>
+        </w:rPr>
+        <w:t xml:space="preserve">syncNfcProfileToPublicDomain(profileId, nfcProfile, orderData?) — </w:t>
+      </w:r>
+      <w:r>
+        <w:t>calls POST /syncNfcProfileDraft with auth token.</w:t>
+      </w:r>
+    </w:p>
+    <w:p>
+      <w:pPr>
+        <w:pStyle w:val="Normal"/>
+      </w:pPr>
+    </w:p>
+    <w:p>
+      <w:pPr>
+        <w:pStyle w:val="BodyText"/>
+      </w:pPr>
+      <w:r>
+        <w:rPr>
+          <w:b/>
+        </w:rPr>
+        <w:t xml:space="preserve">authService.ts — </w:t>
+      </w:r>
+      <w:r>
+        <w:t>NFC-relevant additions (account linking for imported users)</w:t>
+      </w:r>
+    </w:p>
+    <w:p>
+      <w:pPr>
+        <w:pStyle w:val="BodyText"/>
+      </w:pPr>
+      <w:r>
+        <w:rPr>
+          <w:b/>
+        </w:rPr>
+        <w:t xml:space="preserve">signInWithGoogle() — </w:t>
+      </w:r>
+      <w:r>
+        <w:t>catches account-exists, throws auth/needs-password-for-linking.</w:t>
+      </w:r>
+    </w:p>
+    <w:p>
+      <w:pPr>
+        <w:pStyle w:val="BodyText"/>
+      </w:pPr>
+      <w:r>
+        <w:rPr>
+          <w:b/>
+        </w:rPr>
+        <w:t xml:space="preserve">linkGoogleToEmailAccount(email, password, googleCredential) — </w:t>
+      </w:r>
+      <w:r>
+        <w:t>signs in with email/pass then calls linkWithCredential() to link.</w:t>
+      </w:r>
+    </w:p>
+    <w:p>
+      <w:pPr>
+        <w:pStyle w:val="Normal"/>
+      </w:pPr>
+    </w:p>
+    <w:p>
+      <w:pPr>
         <w:pStyle w:val="Heading2"/>
         <w:bidi w:val="0"/>
         <w:ind w:hanging="0" w:start="0"/>
@@ -17073,6 +19367,908 @@
       <w:r>
         <w:rPr/>
       </w:r>
+    </w:p>
+    <w:p>
+      <w:pPr>
+        <w:pStyle w:val="Heading1"/>
+      </w:pPr>
+      <w:r>
+        <w:rPr>
+          <w:b/>
+        </w:rPr>
+        <w:t>21. NFC Smart Cards — Complete Technical Workflow</w:t>
+      </w:r>
+    </w:p>
+    <w:p>
+      <w:pPr>
+        <w:pStyle w:val="Heading2"/>
+      </w:pPr>
+      <w:r>
+        <w:rPr>
+          <w:b/>
+        </w:rPr>
+        <w:t>A. What is an NFC Smart Card in PingME?</w:t>
+      </w:r>
+    </w:p>
+    <w:p>
+      <w:pPr>
+        <w:pStyle w:val="Normal"/>
+      </w:pPr>
+      <w:r>
+        <w:rPr/>
+        <w:t>A PingME NFC Smart Card is a premium PVC card with an embedded NFC chip. When a recipient taps it against any NFC-enabled smartphone, the phone reads the chip and opens the card owner's live digital profile page in the browser — no app required. Each card also carries a QR code as a fallback for devices with NFC disabled.</w:t>
+      </w:r>
+    </w:p>
+    <w:p>
+      <w:pPr>
+        <w:pStyle w:val="Normal"/>
+      </w:pPr>
+      <w:r>
+        <w:rPr/>
+        <w:t>The profile is hosted at: plzpingme.com/&lt;username&gt;  (public, no login required to view)</w:t>
+      </w:r>
+    </w:p>
+    <w:p>
+      <w:pPr>
+        <w:pStyle w:val="Normal"/>
+      </w:pPr>
+      <w:r>
+        <w:rPr/>
+        <w:t>The card owner can edit their profile at any time from their account. The physical card never changes — only the cloud data does.</w:t>
+      </w:r>
+    </w:p>
+    <w:p>
+      <w:pPr>
+        <w:pStyle w:val="Heading2"/>
+      </w:pPr>
+      <w:r>
+        <w:rPr>
+          <w:b/>
+        </w:rPr>
+        <w:t>B. End-to-End Workflow: From Zero to a Live NFC Card</w:t>
+      </w:r>
+    </w:p>
+    <w:p>
+      <w:pPr>
+        <w:pStyle w:val="Heading3"/>
+      </w:pPr>
+      <w:r>
+        <w:rPr>
+          <w:b/>
+        </w:rPr>
+        <w:t>Step 1 — Customer Browses and Adds to Cart</w:t>
+      </w:r>
+    </w:p>
+    <w:p>
+      <w:pPr>
+        <w:pStyle w:val="Normal"/>
+      </w:pPr>
+      <w:r>
+        <w:rPr/>
+        <w:t>The customer visits /products or /products/nfc-cards. NFC card products have item IDs prefixed with nfc- (e.g., nfc-card-default). This prefix is the key identifier used throughout the codebase to detect NFC items. The customer adds the card to the cart. CartContext saves items to localStorage under pingme_cart.</w:t>
+      </w:r>
+    </w:p>
+    <w:p>
+      <w:pPr>
+        <w:pStyle w:val="Heading3"/>
+      </w:pPr>
+      <w:r>
+        <w:rPr>
+          <w:b/>
+        </w:rPr>
+        <w:t>Step 2 — Checkout (Prebook.tsx)</w:t>
+      </w:r>
+    </w:p>
+    <w:p>
+      <w:pPr>
+        <w:pStyle w:val="Normal"/>
+      </w:pPr>
+      <w:r>
+        <w:rPr/>
+        <w:t>The customer navigates to /booking. The page reads the cart from CartContext and calls expandNfcCartUnits() (src/lib/nfcCheckout.ts) to expand each NFC item by its quantity. For example: 1x NFC card at quantity 2 becomes two separate line items — nfc-card-default__0 and nfc-card-default__1 — each with its own lineKey. Each lineKey gets its own NFC profile.</w:t>
+      </w:r>
+    </w:p>
+    <w:p>
+      <w:pPr>
+        <w:pStyle w:val="Normal"/>
+      </w:pPr>
+      <w:r>
+        <w:rPr/>
+        <w:t>The customer fills in their delivery details (name, email, phone, address). If the cart contains any NFC items, the NFCProfileBuilder component (src/components/NFCProfileBuilder.tsx) is shown. The customer fills in their username (permanent, cannot be changed later), name, company, job title, email, phone, social links, UPI ID, documents, and portfolio items.</w:t>
+      </w:r>
+    </w:p>
+    <w:p>
+      <w:pPr>
+        <w:pStyle w:val="Normal"/>
+      </w:pPr>
+      <w:r>
+        <w:rPr/>
+        <w:t>Before proceeding to payment, the profile draft is saved to Firestore via syncNfcProfileDraft Cloud Function (POST /syncNfcProfileDraft). This creates a temporary draft document in the nfcProfiles Firestore collection. Username uniqueness is validated at this point by calling checkUsernameUniqueness() (src/lib/publicNfcService.ts) which calls GET /getPublicNfcProfile?username=&lt;name&gt;.</w:t>
+      </w:r>
+    </w:p>
+    <w:p>
+      <w:pPr>
+        <w:pStyle w:val="Heading3"/>
+      </w:pPr>
+      <w:r>
+        <w:rPr>
+          <w:b/>
+        </w:rPr>
+        <w:t>Step 3 — Payment (Razorpay)</w:t>
+      </w:r>
+    </w:p>
+    <w:p>
+      <w:pPr>
+        <w:pStyle w:val="Normal"/>
+      </w:pPr>
+      <w:r>
+        <w:rPr/>
+        <w:t>The customer clicks Pay Now. The frontend calls POST /createOrder (Cloud Function) with the amount. Razorpay modal opens. Customer pays. On success, the frontend calls POST /verifyPayment (Cloud Function) with paymentId, orderId, signature, and the full orderData including the NFC profiles.</w:t>
+      </w:r>
+    </w:p>
+    <w:p>
+      <w:pPr>
+        <w:pStyle w:val="Heading3"/>
+      </w:pPr>
+      <w:r>
+        <w:rPr>
+          <w:b/>
+        </w:rPr>
+        <w:t>Step 4 — Order Confirmed (verifyPayment Cloud Function)</w:t>
+      </w:r>
+    </w:p>
+    <w:p>
+      <w:pPr>
+        <w:pStyle w:val="Normal"/>
+      </w:pPr>
+      <w:r>
+        <w:rPr/>
+        <w:t>The Cloud Function verifies the Razorpay HMAC signature. On success it writes the order document to Firestore /booking/{orderId} with fields: userId, email, fullName, phone, address, items[], totalAmount, status: confirmed, payment: {...}, nfcLineProfiles: [{lineKey, itemId, title, nfcProfile: {...}}].</w:t>
+      </w:r>
+    </w:p>
+    <w:p>
+      <w:pPr>
+        <w:pStyle w:val="Normal"/>
+      </w:pPr>
+      <w:r>
+        <w:rPr/>
+        <w:t>It then calls syncProfileToNfcProfilesCollection() internally for every NFC line profile. This writes (or overwrites) a document in Firestore /nfcProfiles/{profileDocId} with status: confirmed. The profileDocId is constructed as: {razorpayOrderId}_{lineKey} for multi-card orders, or just {orderId} for legacy single-card orders.</w:t>
+      </w:r>
+    </w:p>
+    <w:p>
+      <w:pPr>
+        <w:pStyle w:val="Normal"/>
+      </w:pPr>
+      <w:r>
+        <w:rPr/>
+        <w:t>The draft document created in Step 2 is also cleaned up by calling POST /deleteNfcProfileDraft.</w:t>
+      </w:r>
+    </w:p>
+    <w:p>
+      <w:pPr>
+        <w:pStyle w:val="Heading3"/>
+      </w:pPr>
+      <w:r>
+        <w:rPr>
+          <w:b/>
+        </w:rPr>
+        <w:t>Step 5 — Card Owner Edits Profile (Profile.tsx + NFCEditModal)</w:t>
+      </w:r>
+    </w:p>
+    <w:p>
+      <w:pPr>
+        <w:pStyle w:val="Normal"/>
+      </w:pPr>
+      <w:r>
+        <w:rPr/>
+        <w:t>The card owner logs into their account at /profile. The OrderHistory component (src/components/profile/OrderHistory.tsx) fetches orders via getUserPrebookings() (src/lib/prebookService.ts), which queries Firestore /booking where userId == user.uid, falling back to email match. For each confirmed NFC order, an Edit NFC Profile button is shown per card.</w:t>
+      </w:r>
+    </w:p>
+    <w:p>
+      <w:pPr>
+        <w:pStyle w:val="Normal"/>
+      </w:pPr>
+      <w:r>
+        <w:rPr/>
+        <w:t>Clicking the button opens NFCEditModal (src/components/profile/NFCEditModal.tsx), which renders the NFCProfileBuilder in edit variant. On save, updatePrebookingNFCProfile() (src/lib/prebookService.ts) updates both the /booking order document and writes to /nfcProfiles via POST /syncNfcProfileDraft (reusing the same endpoint).</w:t>
+      </w:r>
+    </w:p>
+    <w:p>
+      <w:pPr>
+        <w:pStyle w:val="Heading3"/>
+      </w:pPr>
+      <w:r>
+        <w:rPr>
+          <w:b/>
+        </w:rPr>
+        <w:t>Step 6 — Public Profile is Tapped / Scanned</w:t>
+      </w:r>
+    </w:p>
+    <w:p>
+      <w:pPr>
+        <w:pStyle w:val="Normal"/>
+      </w:pPr>
+      <w:r>
+        <w:rPr/>
+        <w:t>When anyone taps the physical NFC card or scans the QR code, they land on /tanusethi (or whatever the username is). PublicNFCProfile.tsx (src/pages/PublicNFCProfile.tsx) calls fetchPublicNfcProfile() (src/lib/publicNfcService.ts) which hits GET /getPublicNfcProfile?username=&lt;name&gt;. In the background it fires a non-blocking POST /trackNfcVisit?username=&lt;name&gt; to log the visit.</w:t>
+      </w:r>
+    </w:p>
+    <w:p>
+      <w:pPr>
+        <w:pStyle w:val="Normal"/>
+      </w:pPr>
+      <w:r>
+        <w:rPr/>
+        <w:t>The public profile page shows: name, company, job title, photo, bio, contact buttons (Call, WhatsApp, Email), social media links, UPI payment link, appointment booking link, company address (opens Google Maps), portfolio/gallery items, and downloadable documents. A Save Contact button generates and downloads a .vcf vCard file. A Share My Info button opens the ShareBackModal.</w:t>
+      </w:r>
+    </w:p>
+    <w:p>
+      <w:pPr>
+        <w:pStyle w:val="Heading3"/>
+      </w:pPr>
+      <w:r>
+        <w:rPr>
+          <w:b/>
+        </w:rPr>
+        <w:t>Step 7 — Reverse Lead Capture (ShareBackModal)</w:t>
+      </w:r>
+    </w:p>
+    <w:p>
+      <w:pPr>
+        <w:pStyle w:val="Normal"/>
+      </w:pPr>
+      <w:r>
+        <w:rPr/>
+        <w:t>After saving the contact, or by clicking Share My Info, the visitor fills their own name, email, phone, and company into a modal form. This calls POST /sendReverseContactEmail (Cloud Function). The function fetches the card owner's email from nfcProfiles, generates an AI-personalized follow-up email draft using Google Gemini, stores the lead in Firestore /nfcLeads, and emails the card owner.</w:t>
+      </w:r>
+    </w:p>
+    <w:p>
+      <w:pPr>
+        <w:pStyle w:val="Heading2"/>
+      </w:pPr>
+      <w:r>
+        <w:rPr>
+          <w:b/>
+        </w:rPr>
+        <w:t>C. All NFC-Related Code Files</w:t>
+      </w:r>
+    </w:p>
+    <w:p>
+      <w:pPr>
+        <w:pStyle w:val="Heading3"/>
+      </w:pPr>
+      <w:r>
+        <w:rPr>
+          <w:b/>
+        </w:rPr>
+        <w:t>Frontend — Pages</w:t>
+      </w:r>
+    </w:p>
+    <w:p>
+      <w:pPr>
+        <w:pStyle w:val="Normal"/>
+      </w:pPr>
+      <w:r>
+        <w:rPr/>
+        <w:t>src/pages/PublicNFCProfile.tsx — The public-facing profile page at /:username. Renders the card owner's full profile. Handles Save Contact (vCard), Share Sheet, Share Back modal, and visit tracking. Contains two sub-components: ShareBackModal and ShareSheet.</w:t>
+      </w:r>
+    </w:p>
+    <w:p>
+      <w:pPr>
+        <w:pStyle w:val="Normal"/>
+      </w:pPr>
+      <w:r>
+        <w:rPr/>
+        <w:t>src/pages/PublicNFCProfile.css — All styles for the public NFC profile page (card layout, buttons, modals, animations).</w:t>
+      </w:r>
+    </w:p>
+    <w:p>
+      <w:pPr>
+        <w:pStyle w:val="Normal"/>
+      </w:pPr>
+      <w:r>
+        <w:rPr/>
+        <w:t>src/pages/NFCLanding.tsx — Marketing/landing page for NFC cards at /nfc (or nfc.plzpingme.com). Shows features, how-it-works steps, use cases, stats, and CTA to buy.</w:t>
+      </w:r>
+    </w:p>
+    <w:p>
+      <w:pPr>
+        <w:pStyle w:val="Normal"/>
+      </w:pPr>
+      <w:r>
+        <w:rPr/>
+        <w:t>src/pages/NfcLeadsDashboard.tsx — Authenticated dashboard at /nfc-leads. Shows all leads captured via the Share Back form. Displays visitor details, AI assessment, and AI-generated follow-up email drafts. Supports multi-card filtering and CSV export.</w:t>
+      </w:r>
+    </w:p>
+    <w:p>
+      <w:pPr>
+        <w:pStyle w:val="Normal"/>
+      </w:pPr>
+      <w:r>
+        <w:rPr/>
+        <w:t>src/pages/NfcLeadsDashboard.css — Styles for the leads dashboard.</w:t>
+      </w:r>
+    </w:p>
+    <w:p>
+      <w:pPr>
+        <w:pStyle w:val="Normal"/>
+      </w:pPr>
+      <w:r>
+        <w:rPr/>
+        <w:t>src/pages/NfcVisitsDashboard.tsx — Authenticated analytics dashboard at /nfc-visits. Shows total scans, device breakdown (mobile/desktop/tablet), OS and browser breakdown, traffic chart (last 30 days), and recent visit activity table. Calls GET /getNfcVisitAnalytics.</w:t>
+      </w:r>
+    </w:p>
+    <w:p>
+      <w:pPr>
+        <w:pStyle w:val="Normal"/>
+      </w:pPr>
+      <w:r>
+        <w:rPr/>
+        <w:t>src/pages/NfcVisitsDashboard.css — Styles for the visits analytics dashboard.</w:t>
+      </w:r>
+    </w:p>
+    <w:p>
+      <w:pPr>
+        <w:pStyle w:val="Normal"/>
+      </w:pPr>
+      <w:r>
+        <w:rPr/>
+        <w:t>src/pages/NfcPrivacyPolicy.tsx — Privacy policy consent gate page located at /:username/NFC-Privacy-Policy. It checks the nfc_consents collection on load using checkConsentInDb(). If consent has been given (consentGiven: true), the user is immediately redirected to the public profile (/:username). Otherwise, it presents the privacy terms, and upon acceptance, writes a record to nfc_consents/{username} using saveConsentToDb() and redirects to the profile.</w:t>
+      </w:r>
+    </w:p>
+    <w:p>
+      <w:pPr>
+        <w:pStyle w:val="Normal"/>
+      </w:pPr>
+      <w:r>
+        <w:rPr/>
+        <w:t>src/pages/Profile.tsx — User account page. Contains the NFC profile editing flow: builds the NFCProfileData draft, opens NFCEditModal per order line.</w:t>
+      </w:r>
+    </w:p>
+    <w:p>
+      <w:pPr>
+        <w:pStyle w:val="Normal"/>
+      </w:pPr>
+      <w:r>
+        <w:rPr/>
+        <w:t>src/pages/Prebook.tsx — Checkout page. Integrates NFCProfileBuilder for profile setup during purchase. Calls expandNfcCartUnits() to build per-card line keys.</w:t>
+      </w:r>
+    </w:p>
+    <w:p>
+      <w:pPr>
+        <w:pStyle w:val="Heading3"/>
+      </w:pPr>
+      <w:r>
+        <w:rPr>
+          <w:b/>
+        </w:rPr>
+        <w:t>Frontend — Components</w:t>
+      </w:r>
+    </w:p>
+    <w:p>
+      <w:pPr>
+        <w:pStyle w:val="Normal"/>
+      </w:pPr>
+      <w:r>
+        <w:rPr/>
+        <w:t>src/components/NFCProfileBuilder.tsx — Multi-section form for building/editing an NFC profile. Used in both checkout (variant=checkout) and profile edit (variant=edit) contexts. Handles: username, name, company, job title, bio, contact info, social links, payment links, portfolio items, documents, and profile photo upload (client-side image compression). Validates required fields and auto-focuses first error.</w:t>
+      </w:r>
+    </w:p>
+    <w:p>
+      <w:pPr>
+        <w:pStyle w:val="Normal"/>
+      </w:pPr>
+      <w:r>
+        <w:rPr/>
+        <w:t>src/components/profile/NFCEditModal.tsx — Dialog wrapper around NFCProfileBuilder for post-purchase editing. Handles unsaved-changes detection and discard confirmation. Uses React Query mutation to call updatePrebookingNFCProfile(). Validates username uniqueness before saving.</w:t>
+      </w:r>
+    </w:p>
+    <w:p>
+      <w:pPr>
+        <w:pStyle w:val="Normal"/>
+      </w:pPr>
+      <w:r>
+        <w:rPr/>
+        <w:t>src/components/profile/OrderHistory.tsx — Renders the order list in /profile. Detects NFC orders (items with nfc- prefix), shows Edit NFC Profile buttons per line card, and wires them to the parent's openEditNFC handler.</w:t>
+      </w:r>
+    </w:p>
+    <w:p>
+      <w:pPr>
+        <w:pStyle w:val="Heading3"/>
+      </w:pPr>
+      <w:r>
+        <w:rPr>
+          <w:b/>
+        </w:rPr>
+        <w:t>Frontend — Service Layer (src/lib/)</w:t>
+      </w:r>
+    </w:p>
+    <w:p>
+      <w:pPr>
+        <w:pStyle w:val="Normal"/>
+      </w:pPr>
+      <w:r>
+        <w:rPr/>
+        <w:t>src/lib/nfcCheckout.ts — Core NFC cart and profile utilities. Key exports:</w:t>
+      </w:r>
+    </w:p>
+    <w:p>
+      <w:pPr>
+        <w:pStyle w:val="Normal"/>
+      </w:pPr>
+      <w:r>
+        <w:rPr/>
+        <w:t xml:space="preserve">  isNfcCartItem(item) — returns true if item.id starts with nfc-</w:t>
+      </w:r>
+    </w:p>
+    <w:p>
+      <w:pPr>
+        <w:pStyle w:val="Normal"/>
+      </w:pPr>
+      <w:r>
+        <w:rPr/>
+        <w:t xml:space="preserve">  expandNfcCartUnits(items) — expands cart items into per-unit NfcCartUnit objects with lineKey = itemId__unitIndex</w:t>
+      </w:r>
+    </w:p>
+    <w:p>
+      <w:pPr>
+        <w:pStyle w:val="Normal"/>
+      </w:pPr>
+      <w:r>
+        <w:rPr/>
+        <w:t xml:space="preserve">  getNfcProfileDocId(paymentOrderId, lineKey) — builds the Firestore doc ID for a profile</w:t>
+      </w:r>
+    </w:p>
+    <w:p>
+      <w:pPr>
+        <w:pStyle w:val="Normal"/>
+      </w:pPr>
+      <w:r>
+        <w:rPr/>
+        <w:t xml:space="preserve">  resolveNfcProfileDocId(params) — resolves the correct doc ID (multi-line vs legacy)</w:t>
+      </w:r>
+    </w:p>
+    <w:p>
+      <w:pPr>
+        <w:pStyle w:val="Normal"/>
+      </w:pPr>
+      <w:r>
+        <w:rPr/>
+        <w:t xml:space="preserve">  getNfcLineProfilesFromOrder(order) — extracts NFC line profiles from an order document</w:t>
+      </w:r>
+    </w:p>
+    <w:p>
+      <w:pPr>
+        <w:pStyle w:val="Normal"/>
+      </w:pPr>
+      <w:r>
+        <w:rPr/>
+        <w:t xml:space="preserve">  isNfcLineProfileComplete(profile) — returns true if profile has at minimum a name</w:t>
+      </w:r>
+    </w:p>
+    <w:p>
+      <w:pPr>
+        <w:pStyle w:val="Normal"/>
+      </w:pPr>
+      <w:r>
+        <w:rPr/>
+        <w:t>src/lib/publicNfcService.ts — Public NFC profile API client (no auth required). Key exports:</w:t>
+      </w:r>
+    </w:p>
+    <w:p>
+      <w:pPr>
+        <w:pStyle w:val="Normal"/>
+      </w:pPr>
+      <w:r>
+        <w:rPr/>
+        <w:t xml:space="preserve">  fetchPublicNfcProfile(username) — GET /getPublicNfcProfile with 5-minute in-memory cache</w:t>
+      </w:r>
+    </w:p>
+    <w:p>
+      <w:pPr>
+        <w:pStyle w:val="Normal"/>
+      </w:pPr>
+      <w:r>
+        <w:rPr/>
+        <w:t xml:space="preserve">  checkUsernameUniqueness(username, owner) — returns true if username is already taken</w:t>
+      </w:r>
+    </w:p>
+    <w:p>
+      <w:pPr>
+        <w:pStyle w:val="Normal"/>
+      </w:pPr>
+      <w:r>
+        <w:rPr/>
+        <w:t xml:space="preserve">  generateUsernameSuggestions(baseName) — suggests 3 available username variants</w:t>
+      </w:r>
+    </w:p>
+    <w:p>
+      <w:pPr>
+        <w:pStyle w:val="Normal"/>
+      </w:pPr>
+      <w:r>
+        <w:rPr/>
+        <w:t xml:space="preserve">  normalizeNfcUsername(raw) — lowercases and trims a username</w:t>
+      </w:r>
+    </w:p>
+    <w:p>
+      <w:pPr>
+        <w:pStyle w:val="Normal"/>
+      </w:pPr>
+      <w:r>
+        <w:rPr/>
+        <w:t>src/lib/prebookService.ts — Contains NFCProfile and NfcLineProfile TypeScript interfaces. Key NFC functions:</w:t>
+      </w:r>
+    </w:p>
+    <w:p>
+      <w:pPr>
+        <w:pStyle w:val="Normal"/>
+      </w:pPr>
+      <w:r>
+        <w:rPr/>
+        <w:t xml:space="preserve">  updatePrebookingNFCProfile(orderId, profile, profileId, lineKey) — updates the /booking doc and syncs to /nfcProfiles via /syncNfcProfileDraft</w:t>
+      </w:r>
+    </w:p>
+    <w:p>
+      <w:pPr>
+        <w:pStyle w:val="Normal"/>
+      </w:pPr>
+      <w:r>
+        <w:rPr/>
+        <w:t xml:space="preserve">  syncNfcProfileToPublicDomain(profileId, profile) — calls POST /syncNfcProfileDraft with auth token</w:t>
+      </w:r>
+    </w:p>
+    <w:p>
+      <w:pPr>
+        <w:pStyle w:val="Normal"/>
+      </w:pPr>
+      <w:r>
+        <w:rPr/>
+        <w:t xml:space="preserve">  getUserPrebookings({userId, email}) — fetches orders; queries by userId first, falls back to email</w:t>
+      </w:r>
+    </w:p>
+    <w:p>
+      <w:pPr>
+        <w:pStyle w:val="Heading3"/>
+      </w:pPr>
+      <w:r>
+        <w:rPr>
+          <w:b/>
+        </w:rPr>
+        <w:t>Cloud Functions (functions/src/index.js)</w:t>
+      </w:r>
+    </w:p>
+    <w:p>
+      <w:pPr>
+        <w:pStyle w:val="Normal"/>
+      </w:pPr>
+      <w:r>
+        <w:rPr/>
+        <w:t>POST /syncNfcProfileDraft — Saves or updates an NFC profile in Firestore /nfcProfiles. Used both for pre-payment drafts (status: draft) and post-payment confirmed profiles. Requires Firebase Auth token. Body: { profileId, nfcProfile }.</w:t>
+      </w:r>
+    </w:p>
+    <w:p>
+      <w:pPr>
+        <w:pStyle w:val="Normal"/>
+      </w:pPr>
+      <w:r>
+        <w:rPr/>
+        <w:t>POST /deleteNfcProfileDraft — Deletes a draft profile from /nfcProfiles. Only deletes if status is draft or updatedSource is prePaymentDraft. Called after payment is verified to clean up the draft. Requires Auth token.</w:t>
+      </w:r>
+    </w:p>
+    <w:p>
+      <w:pPr>
+        <w:pStyle w:val="Normal"/>
+      </w:pPr>
+      <w:r>
+        <w:rPr/>
+        <w:t>GET /getPublicNfcProfile?username=&lt;name&gt; — Public endpoint (no auth). Queries /nfcProfiles where username == &lt;name&gt; and status == confirmed. Returns the profile JSON. Used by the public profile page and username uniqueness checks.</w:t>
+      </w:r>
+    </w:p>
+    <w:p>
+      <w:pPr>
+        <w:pStyle w:val="Normal"/>
+      </w:pPr>
+      <w:r>
+        <w:rPr/>
+        <w:t>POST /trackNfcVisit?username=&lt;name&gt; — Logs a visit to Firestore /nfcVisits. Records device, OS, browser from User-Agent. No auth required. Called non-blocking from the public profile page on load.</w:t>
+      </w:r>
+    </w:p>
+    <w:p>
+      <w:pPr>
+        <w:pStyle w:val="Normal"/>
+      </w:pPr>
+      <w:r>
+        <w:rPr/>
+        <w:t>GET /getNfcVisitAnalytics — Authenticated. Returns analytics for the logged-in user's NFC profiles: total visits, device/OS/browser breakdown, traffic-over-time (last 30 days), recent 15 visits.</w:t>
+      </w:r>
+    </w:p>
+    <w:p>
+      <w:pPr>
+        <w:pStyle w:val="Normal"/>
+      </w:pPr>
+      <w:r>
+        <w:rPr/>
+        <w:t>POST /sendReverseContactEmail — Public endpoint. Called when a visitor submits their info via the Share Back form. Fetches the card owner's email, generates an AI follow-up draft via Gemini, stores the lead in /nfcLeads, and sends an email notification to the card owner.</w:t>
+      </w:r>
+    </w:p>
+    <w:p>
+      <w:pPr>
+        <w:pStyle w:val="Normal"/>
+      </w:pPr>
+      <w:r>
+        <w:rPr/>
+        <w:t>GET /getNfcLeads — Authenticated. Returns all leads captured for the logged-in user's NFC profiles. Includes AI-generated assessment and personalized follow-up email draft per lead.</w:t>
+      </w:r>
+    </w:p>
+    <w:p>
+      <w:pPr>
+        <w:pStyle w:val="Normal"/>
+      </w:pPr>
+      <w:r>
+        <w:rPr/>
+        <w:t>POST /verifyPayment (NFC-relevant section) — After payment verification, iterates over nfcLineProfiles in the order and calls syncProfileToNfcProfilesCollection() for each, writing to /nfcProfiles with status: confirmed.</w:t>
+      </w:r>
+    </w:p>
+    <w:p>
+      <w:pPr>
+        <w:pStyle w:val="Heading3"/>
+      </w:pPr>
+      <w:r>
+        <w:rPr>
+          <w:b/>
+        </w:rPr>
+        <w:t>Scripts (scripts/)</w:t>
+      </w:r>
+    </w:p>
+    <w:p>
+      <w:pPr>
+        <w:pStyle w:val="Normal"/>
+      </w:pPr>
+      <w:r>
+        <w:rPr/>
+        <w:t>scripts/create_nfc_orders.cjs / create_nfc_orders.js — Admin script to bulk-import NFC card buyers. For each buyer: looks up or creates a Firebase Auth account (email + temp password), creates an order document in Firestore /booking with status: confirmed and userId set, creates the public profile in /nfcProfiles. Outputs results to import-results.csv.</w:t>
+      </w:r>
+    </w:p>
+    <w:p>
+      <w:pPr>
+        <w:pStyle w:val="Normal"/>
+      </w:pPr>
+      <w:r>
+        <w:rPr/>
+        <w:t>scripts/import-results.csv — Output of create_nfc_orders.cjs. Contains: Name, Email, Username, Public link, UID (Firebase Auth UID), Temp password. SECURITY NOTE: This file contains plaintext temp passwords. Store securely and do not commit to version control.</w:t>
+      </w:r>
+    </w:p>
+    <w:p>
+      <w:pPr>
+        <w:pStyle w:val="Normal"/>
+      </w:pPr>
+      <w:r>
+        <w:rPr/>
+        <w:t>scripts/fix_missing_profiles.cjs — Repair script. Finds /booking orders that have an nfcProfile but are missing a corresponding /nfcProfiles document, and creates it.</w:t>
+      </w:r>
+    </w:p>
+    <w:p>
+      <w:pPr>
+        <w:pStyle w:val="Normal"/>
+      </w:pPr>
+      <w:r>
+        <w:rPr/>
+        <w:t>scripts/test_link_orders.js — Utility to backfill userId on existing /booking orders that were matched only by email (i.e., orders created before the user had a Firebase Auth account).</w:t>
+      </w:r>
+    </w:p>
+    <w:p>
+      <w:pPr>
+        <w:pStyle w:val="Heading3"/>
+      </w:pPr>
+      <w:r>
+        <w:rPr>
+          <w:b/>
+        </w:rPr>
+        <w:t>Firestore Collections Used by NFC</w:t>
+      </w:r>
+    </w:p>
+    <w:p>
+      <w:pPr>
+        <w:pStyle w:val="Normal"/>
+      </w:pPr>
+      <w:r>
+        <w:rPr/>
+        <w:t>/booking — Primary order collection. Each confirmed order contains: userId, email, items[] (with nfc- prefixed IDs), nfcProfile (legacy single card), nfcLineProfiles[] (multi-card, each with lineKey + nfcProfile).</w:t>
+      </w:r>
+    </w:p>
+    <w:p>
+      <w:pPr>
+        <w:pStyle w:val="Normal"/>
+      </w:pPr>
+      <w:r>
+        <w:rPr/>
+        <w:t>/prebookings — Legacy order collection. Same structure as /booking. Both are queried by getUserPrebookings().</w:t>
+      </w:r>
+    </w:p>
+    <w:p>
+      <w:pPr>
+        <w:pStyle w:val="Normal"/>
+      </w:pPr>
+      <w:r>
+        <w:rPr/>
+        <w:t>/nfcProfiles — Public NFC profile documents. Document ID is {razorpayOrderId}_{lineKey} for multi-card orders, or just {orderId} for single-card/legacy. Fields: orderId, username, name, companyName, jobTitle, email, phone, bio, businessOverview, businessTags, website, address, companyAddress, googleMapsLink, linkedin, twitter, instagram, youtube, facebook, profilePhoto, projects[], documents[], upiId, razorpayLink, appointmentBookingLink, status (draft or confirmed), updatedSource.</w:t>
+      </w:r>
+    </w:p>
+    <w:p>
+      <w:pPr>
+        <w:pStyle w:val="Normal"/>
+      </w:pPr>
+      <w:r>
+        <w:rPr/>
+        <w:t>/nfcLeads — Stores contact info submitted via the Share Back form. Fields: cardOwnerUsername, visitorName, visitorEmail, visitorPhone, visitorCompany, leadAssessment (AI), personalizedEmailSubject (AI), personalizedEmailBody (AI), createdAt.</w:t>
+      </w:r>
+    </w:p>
+    <w:p>
+      <w:pPr>
+        <w:pStyle w:val="Normal"/>
+      </w:pPr>
+      <w:r>
+        <w:rPr/>
+        <w:t>/nfcVisits — Stores visit events for analytics. Fields: username, timestamp, device, os, browser.</w:t>
+      </w:r>
+    </w:p>
+    <w:p>
+      <w:pPr>
+        <w:pStyle w:val="Normal"/>
+      </w:pPr>
+      <w:r>
+        <w:rPr/>
+        <w:t>/nfc_consents — Stores privacy consent records. Document ID is the lowercased username. Fields: consentGiven (boolean), acceptedAt (timestamp), username (string), userAgent (string). Written on consent acceptance, read on public profile access.</w:t>
+      </w:r>
+    </w:p>
+    <w:p>
+      <w:pPr>
+        <w:pStyle w:val="Heading2"/>
+      </w:pPr>
+      <w:r>
+        <w:rPr>
+          <w:b/>
+        </w:rPr>
+        <w:t>D. Key Data Flows Summary</w:t>
+      </w:r>
+    </w:p>
+    <w:p>
+      <w:pPr>
+        <w:pStyle w:val="Normal"/>
+      </w:pPr>
+      <w:r>
+        <w:rPr/>
+        <w:t>1. Purchase flow: Cart → Checkout (expandNfcCartUnits) → NFCProfileBuilder → syncNfcProfileDraft (draft) → Razorpay → verifyPayment → /booking confirmed + /nfcProfiles confirmed + deleteNfcProfileDraft</w:t>
+      </w:r>
+    </w:p>
+    <w:p>
+      <w:pPr>
+        <w:pStyle w:val="Normal"/>
+      </w:pPr>
+      <w:r>
+        <w:rPr/>
+        <w:t>2. Profile edit flow: /profile → OrderHistory → NFCEditModal → NFCProfileBuilder → updatePrebookingNFCProfile → /booking updated + syncNfcProfileDraft → /nfcProfiles updated</w:t>
+      </w:r>
+    </w:p>
+    <w:p>
+      <w:pPr>
+        <w:pStyle w:val="Normal"/>
+      </w:pPr>
+      <w:r>
+        <w:rPr/>
+        <w:t>3. Public scan flow: NFC tap → /:username → fetchPublicNfcProfile (GET /getPublicNfcProfile) → profile rendered + trackNfcVisit logged</w:t>
+      </w:r>
+    </w:p>
+    <w:p>
+      <w:pPr>
+        <w:pStyle w:val="Normal"/>
+      </w:pPr>
+      <w:r>
+        <w:rPr/>
+        <w:t>4. Lead capture flow: Visitor submits Share Back form → POST /sendReverseContactEmail → /nfcLeads created + email sent to card owner + AI draft generated</w:t>
+      </w:r>
+    </w:p>
+    <w:p>
+      <w:pPr>
+        <w:pStyle w:val="Normal"/>
+      </w:pPr>
+      <w:r>
+        <w:rPr/>
+        <w:t>5. Analytics flow: Card owner visits /nfc-visits or /nfc-leads → GET /getNfcVisitAnalytics or GET /getNfcLeads → dashboard rendered</w:t>
+      </w:r>
+    </w:p>
+    <w:p>
+      <w:pPr>
+        <w:pStyle w:val="Normal"/>
+      </w:pPr>
+      <w:r>
+        <w:rPr/>
+        <w:t>6. Privacy Consent flow: NFC tap/Scan → PublicNFCProfile.tsx (/:username) → checks if privacy consent exists in nfc_consents/{username} → if no, redirects to NfcPrivacyPolicy.tsx (/:username/NFC-Privacy-Policy) → user accepts → writes to /nfc_consents/{username} → redirects back to PublicNFCProfile.tsx (/:username) to render profile details.</w:t>
+      </w:r>
+    </w:p>
+    <w:p>
+      <w:pPr>
+        <w:pStyle w:val="Heading2"/>
+      </w:pPr>
+      <w:r>
+        <w:rPr>
+          <w:b/>
+        </w:rPr>
+        <w:t>E. Username Rules</w:t>
+      </w:r>
+    </w:p>
+    <w:p>
+      <w:pPr>
+        <w:pStyle w:val="Normal"/>
+      </w:pPr>
+      <w:r>
+        <w:rPr/>
+        <w:t>Username is permanent — it cannot be changed after the first save. The warning is shown in NFCProfileBuilder and NFCEditModal disables the username field entirely. Username is normalized to lowercase with special characters stripped before storage. Uniqueness is checked against /nfcProfiles (via GET /getPublicNfcProfile) before payment and before each edit save. Username suggestions are generated by checkUsernameUniqueness() with suffix variants (123, _nfc, official, etc.).</w:t>
+      </w:r>
+    </w:p>
+    <w:p>
+      <w:pPr>
+        <w:pStyle w:val="Heading2"/>
+      </w:pPr>
+      <w:r>
+        <w:rPr>
+          <w:b/>
+        </w:rPr>
+        <w:t>F. Account Linking for Imported Users</w:t>
+      </w:r>
+    </w:p>
+    <w:p>
+      <w:pPr>
+        <w:pStyle w:val="Normal"/>
+      </w:pPr>
+      <w:r>
+        <w:rPr/>
+        <w:t>Users imported via create_nfc_orders.cjs have email+password Firebase Auth accounts with a temp password (in import-results.csv). Their /booking orders have userId set to that account's UID. If such a user tries to sign in with Google (same email), Firebase Auth by default creates a separate account — which would NOT match the userId on their order.</w:t>
+      </w:r>
+    </w:p>
+    <w:p>
+      <w:pPr>
+        <w:pStyle w:val="Normal"/>
+      </w:pPr>
+      <w:r>
+        <w:rPr/>
+        <w:t>This is handled in src/lib/authService.ts: the signInWithGoogle() function catches auth/account-exists-with-different-credential, detects a password account exists, and throws auth/needs-password-for-linking. The GoogleAuthButton component (src/components/auth/GoogleAuthButton.tsx) catches this and shows an inline password prompt. The user enters their temp password once, which calls linkGoogleToEmailAccount() — this signs in with email+password then calls linkWithCredential() to attach Google as a second provider under the original UID. From that point on, both sign-in methods resolve to the same UID, and the NFC order is always found.</w:t>
+      </w:r>
+    </w:p>
+    <w:p>
+      <w:pPr>
+        <w:pStyle w:val="Heading2"/>
+      </w:pPr>
+      <w:r>
+        <w:rPr>
+          <w:b/>
+        </w:rPr>
+        <w:t>G. NFC Subdomain (nfc.plzpingme.com)</w:t>
+      </w:r>
+    </w:p>
+    <w:p>
+      <w:pPr>
+        <w:pStyle w:val="Normal"/>
+      </w:pPr>
+      <w:r>
+        <w:rPr/>
+        <w:t>The dist-nfc/ folder is a separate build output for the NFC-only subdomain. It is built from src/nfc-main.tsx (instead of src/main.tsx). The NFCLanding.tsx page handles subdomain detection: if window.location.hostname starts with nfc., the Buy NFC Card button redirects to plzpingme.com/products/nfc-cards instead of navigating internally.</w:t>
+      </w:r>
+    </w:p>
+    <w:p>
+      <w:pPr>
+        <w:pStyle w:val="Normal"/>
+      </w:pPr>
+      <w:r>
+        <w:rPr/>
+        <w:t>The NFC subdomain serves only the landing page. All checkout, profile management, and analytics happen on the main domain app.plzpingme.com.</w:t>
+      </w:r>
+    </w:p>
+    <w:p>
+      <w:pPr>
+        <w:pStyle w:val="Normal"/>
+      </w:pPr>
     </w:p>
     <w:p>
       <w:pPr>

</xml_diff>